<commit_message>
New formatter and other tools
</commit_message>
<xml_diff>
--- a/NBIOS/Bootfähige MINI disk erstellen.docx
+++ b/NBIOS/Bootfähige MINI disk erstellen.docx
@@ -27,7 +27,16 @@
           <w:sz w:val="24"/>
           <w:szCs w:val="24"/>
         </w:rPr>
-        <w:t xml:space="preserve"> bootfähigen </w:t>
+        <w:t xml:space="preserve"> bootfähige</w:t>
+      </w:r>
+      <w:r>
+        <w:rPr>
+          <w:rFonts w:ascii="Arial" w:hAnsi="Arial" w:cs="Arial"/>
+          <w:b/>
+          <w:sz w:val="24"/>
+          <w:szCs w:val="24"/>
+        </w:rPr>
+        <w:t xml:space="preserve"> </w:t>
       </w:r>
       <w:r>
         <w:rPr>
@@ -62,25 +71,7 @@
           <w:sz w:val="24"/>
           <w:szCs w:val="24"/>
         </w:rPr>
-        <w:t xml:space="preserve">Diese Anleitung ist lediglich eine Ergänzung zur Anleitung von Ulrich </w:t>
-      </w:r>
-      <w:proofErr w:type="spellStart"/>
-      <w:r>
-        <w:rPr>
-          <w:rFonts w:ascii="Arial" w:hAnsi="Arial" w:cs="Arial"/>
-          <w:sz w:val="24"/>
-          <w:szCs w:val="24"/>
-        </w:rPr>
-        <w:t>Haumann</w:t>
-      </w:r>
-      <w:proofErr w:type="spellEnd"/>
-      <w:r>
-        <w:rPr>
-          <w:rFonts w:ascii="Arial" w:hAnsi="Arial" w:cs="Arial"/>
-          <w:sz w:val="24"/>
-          <w:szCs w:val="24"/>
-        </w:rPr>
-        <w:t>. Die Ergänzun</w:t>
+        <w:t>Diese Anleitung ist lediglich eine Ergänzung zur Anleitung von Ulrich Haumann. Die Ergänzun</w:t>
       </w:r>
       <w:r>
         <w:rPr>
@@ -113,25 +104,40 @@
           <w:sz w:val="24"/>
           <w:szCs w:val="24"/>
         </w:rPr>
-        <w:t xml:space="preserve">Ich empfehle zum Arbeiten mit dem MC CP/M-Computer generell das Windows-Terminal-Programm </w:t>
-      </w:r>
-      <w:proofErr w:type="spellStart"/>
-      <w:r>
-        <w:rPr>
-          <w:rFonts w:ascii="Arial" w:hAnsi="Arial" w:cs="Arial"/>
-          <w:sz w:val="24"/>
-          <w:szCs w:val="24"/>
-        </w:rPr>
-        <w:t>TeraTerm</w:t>
-      </w:r>
-      <w:proofErr w:type="spellEnd"/>
-      <w:r>
-        <w:rPr>
-          <w:rFonts w:ascii="Arial" w:hAnsi="Arial" w:cs="Arial"/>
-          <w:sz w:val="24"/>
-          <w:szCs w:val="24"/>
-        </w:rPr>
-        <w:t>. A</w:t>
+        <w:t>Mit Mini-Disk i</w:t>
+      </w:r>
+      <w:r>
+        <w:rPr>
+          <w:rFonts w:ascii="Arial" w:hAnsi="Arial" w:cs="Arial"/>
+          <w:sz w:val="24"/>
+          <w:szCs w:val="24"/>
+        </w:rPr>
+        <w:t>st</w:t>
+      </w:r>
+      <w:r>
+        <w:rPr>
+          <w:rFonts w:ascii="Arial" w:hAnsi="Arial" w:cs="Arial"/>
+          <w:sz w:val="24"/>
+          <w:szCs w:val="24"/>
+        </w:rPr>
+        <w:t xml:space="preserve"> eine 3 ½“ oder 5 ¼“ Diskette gemeint. Im Gegensatz zu 8“ Disketten, die zu CP/M-Zeiten als Maxi-Disk bezeichne wurden.</w:t>
+      </w:r>
+    </w:p>
+    <w:p>
+      <w:pPr>
+        <w:rPr>
+          <w:rFonts w:ascii="Arial" w:hAnsi="Arial" w:cs="Arial"/>
+          <w:sz w:val="24"/>
+          <w:szCs w:val="24"/>
+        </w:rPr>
+      </w:pPr>
+      <w:r>
+        <w:rPr>
+          <w:rFonts w:ascii="Arial" w:hAnsi="Arial" w:cs="Arial"/>
+          <w:sz w:val="24"/>
+          <w:szCs w:val="24"/>
+        </w:rPr>
+        <w:t>Ich empfehle zum Arbeiten mit dem MC CP/M-Computer generell das Windows-Terminal-Programm TeraTerm. A</w:t>
       </w:r>
       <w:r>
         <w:rPr>
@@ -237,7 +243,31 @@
           <w:sz w:val="24"/>
           <w:szCs w:val="24"/>
         </w:rPr>
-        <w:t>CP/M (BOS+CCP) auf Adresse</w:t>
+        <w:t>CP/M (B</w:t>
+      </w:r>
+      <w:r>
+        <w:rPr>
+          <w:rFonts w:ascii="Arial" w:hAnsi="Arial" w:cs="Arial"/>
+          <w:sz w:val="24"/>
+          <w:szCs w:val="24"/>
+        </w:rPr>
+        <w:t>D</w:t>
+      </w:r>
+      <w:r>
+        <w:rPr>
+          <w:rFonts w:ascii="Arial" w:hAnsi="Arial" w:cs="Arial"/>
+          <w:sz w:val="24"/>
+          <w:szCs w:val="24"/>
+        </w:rPr>
+        <w:t>OS+CCP) auf Adresse</w:t>
+      </w:r>
+      <w:r>
+        <w:rPr>
+          <w:rFonts w:ascii="Arial" w:hAnsi="Arial" w:cs="Arial"/>
+          <w:sz w:val="24"/>
+          <w:szCs w:val="24"/>
+        </w:rPr>
+        <w:t>:</w:t>
       </w:r>
       <w:r>
         <w:rPr>
@@ -271,6 +301,14 @@
           <w:sz w:val="24"/>
           <w:szCs w:val="24"/>
         </w:rPr>
+        <w:t>:</w:t>
+      </w:r>
+      <w:r>
+        <w:rPr>
+          <w:rFonts w:ascii="Arial" w:hAnsi="Arial" w:cs="Arial"/>
+          <w:sz w:val="24"/>
+          <w:szCs w:val="24"/>
+        </w:rPr>
         <w:tab/>
       </w:r>
       <w:r>
@@ -292,6 +330,14 @@
       <w:r>
         <w:rPr>
           <w:rFonts w:ascii="Arial" w:hAnsi="Arial" w:cs="Arial"/>
+          <w:sz w:val="24"/>
+          <w:szCs w:val="24"/>
+        </w:rPr>
+        <w:tab/>
+      </w:r>
+      <w:r>
+        <w:rPr>
+          <w:rFonts w:ascii="Arial" w:hAnsi="Arial" w:cs="Arial"/>
           <w:b/>
           <w:sz w:val="24"/>
           <w:szCs w:val="24"/>
@@ -330,7 +376,15 @@
           <w:sz w:val="24"/>
           <w:szCs w:val="24"/>
         </w:rPr>
-        <w:t>Daraus geht hervor wohin wir die Binärfiles laden müssen.</w:t>
+        <w:t xml:space="preserve">Daraus geht hervor, </w:t>
+      </w:r>
+      <w:r>
+        <w:rPr>
+          <w:rFonts w:ascii="Arial" w:hAnsi="Arial" w:cs="Arial"/>
+          <w:sz w:val="24"/>
+          <w:szCs w:val="24"/>
+        </w:rPr>
+        <w:t>wohin wir die Binärfiles laden müssen.</w:t>
       </w:r>
     </w:p>
     <w:p>
@@ -399,24 +453,7 @@
           <w:szCs w:val="24"/>
         </w:rPr>
         <w:tab/>
-      </w:r>
-      <w:proofErr w:type="gramStart"/>
-      <w:r>
-        <w:rPr>
-          <w:rFonts w:ascii="Arial" w:hAnsi="Arial" w:cs="Arial"/>
-          <w:sz w:val="24"/>
-          <w:szCs w:val="24"/>
-        </w:rPr>
-        <w:t>das</w:t>
-      </w:r>
-      <w:proofErr w:type="gramEnd"/>
-      <w:r>
-        <w:rPr>
-          <w:rFonts w:ascii="Arial" w:hAnsi="Arial" w:cs="Arial"/>
-          <w:sz w:val="24"/>
-          <w:szCs w:val="24"/>
-        </w:rPr>
-        <w:t xml:space="preserve"> </w:t>
+        <w:t xml:space="preserve">das </w:t>
       </w:r>
       <w:r>
         <w:rPr>
@@ -736,20 +773,250 @@
           <w:szCs w:val="24"/>
         </w:rPr>
         <w:tab/>
-      </w:r>
-      <w:proofErr w:type="spellStart"/>
-      <w:r>
-        <w:rPr>
-          <w:rFonts w:ascii="Arial" w:hAnsi="Arial" w:cs="Arial"/>
-          <w:sz w:val="24"/>
-          <w:szCs w:val="24"/>
-        </w:rPr>
-        <w:t>Bootloader</w:t>
-      </w:r>
-      <w:proofErr w:type="spellEnd"/>
-      <w:r>
-        <w:rPr>
-          <w:rFonts w:ascii="Arial" w:hAnsi="Arial" w:cs="Arial"/>
+        <w:t xml:space="preserve">Bootloader </w:t>
+      </w:r>
+      <w:r>
+        <w:rPr>
+          <w:rFonts w:ascii="Arial" w:hAnsi="Arial" w:cs="Arial"/>
+          <w:sz w:val="24"/>
+          <w:szCs w:val="24"/>
+        </w:rPr>
+        <w:t>(</w:t>
+      </w:r>
+      <w:r>
+        <w:rPr>
+          <w:rFonts w:ascii="Arial" w:hAnsi="Arial" w:cs="Arial"/>
+          <w:sz w:val="24"/>
+          <w:szCs w:val="24"/>
+        </w:rPr>
+        <w:t xml:space="preserve">wird auf </w:t>
+      </w:r>
+      <w:r>
+        <w:rPr>
+          <w:rFonts w:ascii="Arial" w:hAnsi="Arial" w:cs="Arial"/>
+          <w:sz w:val="24"/>
+          <w:szCs w:val="24"/>
+        </w:rPr>
+        <w:t>A</w:t>
+      </w:r>
+      <w:r>
+        <w:rPr>
+          <w:rFonts w:ascii="Arial" w:hAnsi="Arial" w:cs="Arial"/>
+          <w:sz w:val="24"/>
+          <w:szCs w:val="24"/>
+        </w:rPr>
+        <w:t>dresse 1</w:t>
+      </w:r>
+      <w:r>
+        <w:rPr>
+          <w:rFonts w:ascii="Arial" w:hAnsi="Arial" w:cs="Arial"/>
+          <w:sz w:val="24"/>
+          <w:szCs w:val="24"/>
+        </w:rPr>
+        <w:t>000h</w:t>
+      </w:r>
+      <w:r>
+        <w:rPr>
+          <w:rFonts w:ascii="Arial" w:hAnsi="Arial" w:cs="Arial"/>
+          <w:sz w:val="24"/>
+          <w:szCs w:val="24"/>
+        </w:rPr>
+        <w:t xml:space="preserve"> geladen</w:t>
+      </w:r>
+      <w:r>
+        <w:rPr>
+          <w:rFonts w:ascii="Arial" w:hAnsi="Arial" w:cs="Arial"/>
+          <w:sz w:val="24"/>
+          <w:szCs w:val="24"/>
+        </w:rPr>
+        <w:t>)</w:t>
+      </w:r>
+    </w:p>
+    <w:p>
+      <w:pPr>
+        <w:ind w:left="2832" w:hanging="2832"/>
+        <w:rPr>
+          <w:rFonts w:ascii="Arial" w:hAnsi="Arial" w:cs="Arial"/>
+          <w:sz w:val="24"/>
+          <w:szCs w:val="24"/>
+        </w:rPr>
+      </w:pPr>
+      <w:r>
+        <w:rPr>
+          <w:rFonts w:ascii="Arial" w:hAnsi="Arial" w:cs="Arial"/>
+          <w:sz w:val="24"/>
+          <w:szCs w:val="24"/>
+        </w:rPr>
+        <w:t>N</w:t>
+      </w:r>
+      <w:r>
+        <w:rPr>
+          <w:rFonts w:ascii="Arial" w:hAnsi="Arial" w:cs="Arial"/>
+          <w:sz w:val="24"/>
+          <w:szCs w:val="24"/>
+        </w:rPr>
+        <w:t>PUTBOOT</w:t>
+      </w:r>
+      <w:r>
+        <w:rPr>
+          <w:rFonts w:ascii="Arial" w:hAnsi="Arial" w:cs="Arial"/>
+          <w:sz w:val="24"/>
+          <w:szCs w:val="24"/>
+        </w:rPr>
+        <w:t>.HEX</w:t>
+      </w:r>
+      <w:r>
+        <w:rPr>
+          <w:rFonts w:ascii="Arial" w:hAnsi="Arial" w:cs="Arial"/>
+          <w:sz w:val="24"/>
+          <w:szCs w:val="24"/>
+        </w:rPr>
+        <w:tab/>
+      </w:r>
+      <w:r>
+        <w:rPr>
+          <w:rFonts w:ascii="Arial" w:hAnsi="Arial" w:cs="Arial"/>
+          <w:sz w:val="24"/>
+          <w:szCs w:val="24"/>
+        </w:rPr>
+        <w:t>S</w:t>
+      </w:r>
+      <w:r>
+        <w:rPr>
+          <w:rFonts w:ascii="Arial" w:hAnsi="Arial" w:cs="Arial"/>
+          <w:sz w:val="24"/>
+          <w:szCs w:val="24"/>
+        </w:rPr>
+        <w:t xml:space="preserve">chreibt </w:t>
+      </w:r>
+      <w:r>
+        <w:rPr>
+          <w:rFonts w:ascii="Arial" w:hAnsi="Arial" w:cs="Arial"/>
+          <w:sz w:val="24"/>
+          <w:szCs w:val="24"/>
+        </w:rPr>
+        <w:t xml:space="preserve">den </w:t>
+      </w:r>
+      <w:r>
+        <w:rPr>
+          <w:rFonts w:ascii="Arial" w:hAnsi="Arial" w:cs="Arial"/>
+          <w:sz w:val="24"/>
+          <w:szCs w:val="24"/>
+        </w:rPr>
+        <w:t xml:space="preserve">Bootloader </w:t>
+      </w:r>
+      <w:r>
+        <w:rPr>
+          <w:rFonts w:ascii="Arial" w:hAnsi="Arial" w:cs="Arial"/>
+          <w:sz w:val="24"/>
+          <w:szCs w:val="24"/>
+        </w:rPr>
+        <w:t xml:space="preserve">von </w:t>
+      </w:r>
+      <w:r>
+        <w:rPr>
+          <w:rFonts w:ascii="Arial" w:hAnsi="Arial" w:cs="Arial"/>
+          <w:sz w:val="24"/>
+          <w:szCs w:val="24"/>
+        </w:rPr>
+        <w:t xml:space="preserve">1000h auf </w:t>
+      </w:r>
+      <w:r>
+        <w:rPr>
+          <w:rFonts w:ascii="Arial" w:hAnsi="Arial" w:cs="Arial"/>
+          <w:sz w:val="24"/>
+          <w:szCs w:val="24"/>
+        </w:rPr>
+        <w:t>die Diskette</w:t>
+      </w:r>
+    </w:p>
+    <w:p>
+      <w:pPr>
+        <w:pStyle w:val="Listenabsatz"/>
+        <w:numPr>
+          <w:ilvl w:val="0"/>
+          <w:numId w:val="2"/>
+        </w:numPr>
+        <w:rPr>
+          <w:rFonts w:ascii="Arial" w:hAnsi="Arial" w:cs="Arial"/>
+          <w:b/>
+          <w:sz w:val="24"/>
+          <w:szCs w:val="24"/>
+        </w:rPr>
+      </w:pPr>
+      <w:r>
+        <w:rPr>
+          <w:rFonts w:ascii="Arial" w:hAnsi="Arial" w:cs="Arial"/>
+          <w:b/>
+          <w:sz w:val="24"/>
+          <w:szCs w:val="24"/>
+        </w:rPr>
+        <w:t>Formatieren des Datenträgers</w:t>
+      </w:r>
+    </w:p>
+    <w:p>
+      <w:pPr>
+        <w:rPr>
+          <w:rFonts w:ascii="Arial" w:hAnsi="Arial" w:cs="Arial"/>
+          <w:sz w:val="24"/>
+          <w:szCs w:val="24"/>
+        </w:rPr>
+      </w:pPr>
+      <w:r>
+        <w:rPr>
+          <w:rFonts w:ascii="Arial" w:hAnsi="Arial" w:cs="Arial"/>
+          <w:sz w:val="24"/>
+          <w:szCs w:val="24"/>
+        </w:rPr>
+        <w:t>Die einzurichtende Diskette in Drive 0 (Laufwerk A:) einlegen.</w:t>
+      </w:r>
+    </w:p>
+    <w:p>
+      <w:pPr>
+        <w:rPr>
+          <w:rFonts w:ascii="Arial" w:hAnsi="Arial" w:cs="Arial"/>
+          <w:sz w:val="24"/>
+          <w:szCs w:val="24"/>
+        </w:rPr>
+      </w:pPr>
+      <w:r>
+        <w:rPr>
+          <w:rFonts w:ascii="Arial" w:hAnsi="Arial" w:cs="Arial"/>
+          <w:sz w:val="24"/>
+          <w:szCs w:val="24"/>
+        </w:rPr>
+        <w:t>M</w:t>
+      </w:r>
+      <w:r>
+        <w:rPr>
+          <w:rFonts w:ascii="Arial" w:hAnsi="Arial" w:cs="Arial"/>
+          <w:sz w:val="24"/>
+          <w:szCs w:val="24"/>
+        </w:rPr>
+        <w:t xml:space="preserve">it </w:t>
+      </w:r>
+      <w:r>
+        <w:rPr>
+          <w:rFonts w:ascii="Arial" w:hAnsi="Arial" w:cs="Arial"/>
+          <w:b/>
+          <w:sz w:val="24"/>
+          <w:szCs w:val="24"/>
+        </w:rPr>
+        <w:t>r100</w:t>
+      </w:r>
+      <w:r>
+        <w:rPr>
+          <w:rFonts w:ascii="Arial" w:hAnsi="Arial" w:cs="Arial"/>
+          <w:b/>
+          <w:sz w:val="24"/>
+          <w:szCs w:val="24"/>
+        </w:rPr>
+        <w:t xml:space="preserve"> (+Enter)</w:t>
+      </w:r>
+      <w:r>
+        <w:rPr>
+          <w:rFonts w:ascii="Arial" w:hAnsi="Arial" w:cs="Arial"/>
+          <w:b/>
           <w:sz w:val="24"/>
           <w:szCs w:val="24"/>
         </w:rPr>
@@ -761,366 +1028,118 @@
           <w:sz w:val="24"/>
           <w:szCs w:val="24"/>
         </w:rPr>
-        <w:t>(</w:t>
-      </w:r>
-      <w:r>
-        <w:rPr>
-          <w:rFonts w:ascii="Arial" w:hAnsi="Arial" w:cs="Arial"/>
-          <w:sz w:val="24"/>
-          <w:szCs w:val="24"/>
-        </w:rPr>
-        <w:t xml:space="preserve">wird auf </w:t>
-      </w:r>
-      <w:r>
-        <w:rPr>
-          <w:rFonts w:ascii="Arial" w:hAnsi="Arial" w:cs="Arial"/>
-          <w:sz w:val="24"/>
-          <w:szCs w:val="24"/>
-        </w:rPr>
-        <w:t>A</w:t>
-      </w:r>
-      <w:r>
-        <w:rPr>
-          <w:rFonts w:ascii="Arial" w:hAnsi="Arial" w:cs="Arial"/>
-          <w:sz w:val="24"/>
-          <w:szCs w:val="24"/>
-        </w:rPr>
-        <w:t>dresse 1</w:t>
-      </w:r>
-      <w:r>
-        <w:rPr>
-          <w:rFonts w:ascii="Arial" w:hAnsi="Arial" w:cs="Arial"/>
-          <w:sz w:val="24"/>
-          <w:szCs w:val="24"/>
-        </w:rPr>
-        <w:t>000h</w:t>
-      </w:r>
-      <w:r>
-        <w:rPr>
-          <w:rFonts w:ascii="Arial" w:hAnsi="Arial" w:cs="Arial"/>
-          <w:sz w:val="24"/>
-          <w:szCs w:val="24"/>
-        </w:rPr>
-        <w:t xml:space="preserve"> geladen</w:t>
-      </w:r>
-      <w:r>
-        <w:rPr>
-          <w:rFonts w:ascii="Arial" w:hAnsi="Arial" w:cs="Arial"/>
+        <w:t xml:space="preserve">und „Send File“ </w:t>
+      </w:r>
+      <w:r>
+        <w:rPr>
+          <w:rFonts w:ascii="Arial" w:hAnsi="Arial" w:cs="Arial"/>
+          <w:b/>
+          <w:sz w:val="24"/>
+          <w:szCs w:val="24"/>
+        </w:rPr>
+        <w:t>NFORM.HEX</w:t>
+      </w:r>
+      <w:r>
+        <w:rPr>
+          <w:rFonts w:ascii="Arial" w:hAnsi="Arial" w:cs="Arial"/>
+          <w:sz w:val="24"/>
+          <w:szCs w:val="24"/>
+        </w:rPr>
+        <w:t xml:space="preserve"> das Format-Programm laden</w:t>
+      </w:r>
+      <w:r>
+        <w:rPr>
+          <w:rFonts w:ascii="Arial" w:hAnsi="Arial" w:cs="Arial"/>
+          <w:sz w:val="24"/>
+          <w:szCs w:val="24"/>
+        </w:rPr>
+        <w:t xml:space="preserve">. Der Monitor meldet </w:t>
+      </w:r>
+      <w:r>
+        <w:rPr>
+          <w:rFonts w:ascii="Arial" w:hAnsi="Arial" w:cs="Arial"/>
+          <w:b/>
+          <w:sz w:val="24"/>
+          <w:szCs w:val="24"/>
+        </w:rPr>
+        <w:t>FF*</w:t>
+      </w:r>
+      <w:r>
+        <w:rPr>
+          <w:rFonts w:ascii="Arial" w:hAnsi="Arial" w:cs="Arial"/>
+          <w:sz w:val="24"/>
+          <w:szCs w:val="24"/>
+        </w:rPr>
+        <w:t xml:space="preserve"> bei erfolgreicher Übertragung.</w:t>
+      </w:r>
+      <w:r>
+        <w:rPr>
+          <w:rFonts w:ascii="Arial" w:hAnsi="Arial" w:cs="Arial"/>
+          <w:sz w:val="24"/>
+          <w:szCs w:val="24"/>
+        </w:rPr>
+        <w:t xml:space="preserve"> </w:t>
+      </w:r>
+      <w:r>
+        <w:rPr>
+          <w:rFonts w:ascii="Arial" w:hAnsi="Arial" w:cs="Arial"/>
+          <w:sz w:val="24"/>
+          <w:szCs w:val="24"/>
+        </w:rPr>
+        <w:t>NFORM m</w:t>
+      </w:r>
+      <w:r>
+        <w:rPr>
+          <w:rFonts w:ascii="Arial" w:hAnsi="Arial" w:cs="Arial"/>
+          <w:sz w:val="24"/>
+          <w:szCs w:val="24"/>
+        </w:rPr>
+        <w:t xml:space="preserve">it </w:t>
+      </w:r>
+      <w:r>
+        <w:rPr>
+          <w:rFonts w:ascii="Arial" w:hAnsi="Arial" w:cs="Arial"/>
+          <w:b/>
+          <w:sz w:val="24"/>
+          <w:szCs w:val="24"/>
+        </w:rPr>
+        <w:t>g100</w:t>
+      </w:r>
+      <w:r>
+        <w:rPr>
+          <w:rFonts w:ascii="Arial" w:hAnsi="Arial" w:cs="Arial"/>
+          <w:sz w:val="24"/>
+          <w:szCs w:val="24"/>
+        </w:rPr>
+        <w:t xml:space="preserve"> </w:t>
+      </w:r>
+      <w:r>
+        <w:rPr>
+          <w:rFonts w:ascii="Arial" w:hAnsi="Arial" w:cs="Arial"/>
+          <w:b/>
+          <w:sz w:val="24"/>
+          <w:szCs w:val="24"/>
+        </w:rPr>
+        <w:t>(+</w:t>
+      </w:r>
+      <w:r>
+        <w:rPr>
+          <w:rFonts w:ascii="Arial" w:hAnsi="Arial" w:cs="Arial"/>
+          <w:b/>
+          <w:sz w:val="24"/>
+          <w:szCs w:val="24"/>
+        </w:rPr>
+        <w:t>Enter</w:t>
+      </w:r>
+      <w:r>
+        <w:rPr>
+          <w:rFonts w:ascii="Arial" w:hAnsi="Arial" w:cs="Arial"/>
+          <w:b/>
           <w:sz w:val="24"/>
           <w:szCs w:val="24"/>
         </w:rPr>
         <w:t>)</w:t>
       </w:r>
-    </w:p>
-    <w:p>
-      <w:pPr>
-        <w:ind w:left="2832" w:hanging="2832"/>
-        <w:rPr>
-          <w:rFonts w:ascii="Arial" w:hAnsi="Arial" w:cs="Arial"/>
-          <w:sz w:val="24"/>
-          <w:szCs w:val="24"/>
-        </w:rPr>
-      </w:pPr>
-      <w:r>
-        <w:rPr>
-          <w:rFonts w:ascii="Arial" w:hAnsi="Arial" w:cs="Arial"/>
-          <w:sz w:val="24"/>
-          <w:szCs w:val="24"/>
-        </w:rPr>
-        <w:t>N</w:t>
-      </w:r>
-      <w:r>
-        <w:rPr>
-          <w:rFonts w:ascii="Arial" w:hAnsi="Arial" w:cs="Arial"/>
-          <w:sz w:val="24"/>
-          <w:szCs w:val="24"/>
-        </w:rPr>
-        <w:t>PUTBOOT</w:t>
-      </w:r>
-      <w:r>
-        <w:rPr>
-          <w:rFonts w:ascii="Arial" w:hAnsi="Arial" w:cs="Arial"/>
-          <w:sz w:val="24"/>
-          <w:szCs w:val="24"/>
-        </w:rPr>
-        <w:t>.HEX</w:t>
-      </w:r>
-      <w:r>
-        <w:rPr>
-          <w:rFonts w:ascii="Arial" w:hAnsi="Arial" w:cs="Arial"/>
-          <w:sz w:val="24"/>
-          <w:szCs w:val="24"/>
-        </w:rPr>
-        <w:tab/>
-      </w:r>
-      <w:r>
-        <w:rPr>
-          <w:rFonts w:ascii="Arial" w:hAnsi="Arial" w:cs="Arial"/>
-          <w:sz w:val="24"/>
-          <w:szCs w:val="24"/>
-        </w:rPr>
-        <w:t>S</w:t>
-      </w:r>
-      <w:r>
-        <w:rPr>
-          <w:rFonts w:ascii="Arial" w:hAnsi="Arial" w:cs="Arial"/>
-          <w:sz w:val="24"/>
-          <w:szCs w:val="24"/>
-        </w:rPr>
-        <w:t xml:space="preserve">chreibt </w:t>
-      </w:r>
-      <w:r>
-        <w:rPr>
-          <w:rFonts w:ascii="Arial" w:hAnsi="Arial" w:cs="Arial"/>
-          <w:sz w:val="24"/>
-          <w:szCs w:val="24"/>
-        </w:rPr>
-        <w:t xml:space="preserve">den </w:t>
-      </w:r>
-      <w:proofErr w:type="spellStart"/>
-      <w:r>
-        <w:rPr>
-          <w:rFonts w:ascii="Arial" w:hAnsi="Arial" w:cs="Arial"/>
-          <w:sz w:val="24"/>
-          <w:szCs w:val="24"/>
-        </w:rPr>
-        <w:t>Bootloader</w:t>
-      </w:r>
-      <w:proofErr w:type="spellEnd"/>
-      <w:r>
-        <w:rPr>
-          <w:rFonts w:ascii="Arial" w:hAnsi="Arial" w:cs="Arial"/>
-          <w:sz w:val="24"/>
-          <w:szCs w:val="24"/>
-        </w:rPr>
-        <w:t xml:space="preserve"> </w:t>
-      </w:r>
-      <w:r>
-        <w:rPr>
-          <w:rFonts w:ascii="Arial" w:hAnsi="Arial" w:cs="Arial"/>
-          <w:sz w:val="24"/>
-          <w:szCs w:val="24"/>
-        </w:rPr>
-        <w:t xml:space="preserve">von </w:t>
-      </w:r>
-      <w:r>
-        <w:rPr>
-          <w:rFonts w:ascii="Arial" w:hAnsi="Arial" w:cs="Arial"/>
-          <w:sz w:val="24"/>
-          <w:szCs w:val="24"/>
-        </w:rPr>
-        <w:t xml:space="preserve">1000h auf </w:t>
-      </w:r>
-      <w:r>
-        <w:rPr>
-          <w:rFonts w:ascii="Arial" w:hAnsi="Arial" w:cs="Arial"/>
-          <w:sz w:val="24"/>
-          <w:szCs w:val="24"/>
-        </w:rPr>
-        <w:t>die Diskette</w:t>
-      </w:r>
-    </w:p>
-    <w:p>
-      <w:pPr>
-        <w:rPr>
-          <w:rFonts w:ascii="Arial" w:hAnsi="Arial" w:cs="Arial"/>
-          <w:b/>
-          <w:sz w:val="24"/>
-          <w:szCs w:val="24"/>
-        </w:rPr>
-      </w:pPr>
-      <w:r>
-        <w:rPr>
-          <w:rFonts w:ascii="Arial" w:hAnsi="Arial" w:cs="Arial"/>
-          <w:b/>
-          <w:sz w:val="24"/>
-          <w:szCs w:val="24"/>
-        </w:rPr>
-        <w:t>Formatieren des Datenträgers</w:t>
-      </w:r>
-    </w:p>
-    <w:p>
-      <w:pPr>
-        <w:rPr>
-          <w:rFonts w:ascii="Arial" w:hAnsi="Arial" w:cs="Arial"/>
-          <w:sz w:val="24"/>
-          <w:szCs w:val="24"/>
-        </w:rPr>
-      </w:pPr>
-      <w:r>
-        <w:rPr>
-          <w:rFonts w:ascii="Arial" w:hAnsi="Arial" w:cs="Arial"/>
-          <w:sz w:val="24"/>
-          <w:szCs w:val="24"/>
-        </w:rPr>
-        <w:t xml:space="preserve">Mit </w:t>
-      </w:r>
-      <w:r>
-        <w:rPr>
-          <w:rFonts w:ascii="Arial" w:hAnsi="Arial" w:cs="Arial"/>
-          <w:b/>
-          <w:sz w:val="24"/>
-          <w:szCs w:val="24"/>
-        </w:rPr>
-        <w:t>r100</w:t>
-      </w:r>
-      <w:r>
-        <w:rPr>
-          <w:rFonts w:ascii="Arial" w:hAnsi="Arial" w:cs="Arial"/>
-          <w:sz w:val="24"/>
-          <w:szCs w:val="24"/>
-        </w:rPr>
-        <w:t xml:space="preserve">  </w:t>
-      </w:r>
-      <w:r>
-        <w:rPr>
-          <w:rFonts w:ascii="Arial" w:hAnsi="Arial" w:cs="Arial"/>
-          <w:sz w:val="24"/>
-          <w:szCs w:val="24"/>
-        </w:rPr>
-        <w:sym w:font="Wingdings" w:char="F0E0"/>
-      </w:r>
-      <w:r>
-        <w:rPr>
-          <w:rFonts w:ascii="Arial" w:hAnsi="Arial" w:cs="Arial"/>
-          <w:sz w:val="24"/>
-          <w:szCs w:val="24"/>
-        </w:rPr>
-        <w:t xml:space="preserve"> </w:t>
-      </w:r>
-      <w:r>
-        <w:rPr>
-          <w:rFonts w:ascii="Arial" w:hAnsi="Arial" w:cs="Arial"/>
-          <w:b/>
-          <w:sz w:val="24"/>
-          <w:szCs w:val="24"/>
-        </w:rPr>
-        <w:t>Enter</w:t>
-      </w:r>
-      <w:r>
-        <w:rPr>
-          <w:rFonts w:ascii="Arial" w:hAnsi="Arial" w:cs="Arial"/>
-          <w:sz w:val="24"/>
-          <w:szCs w:val="24"/>
-        </w:rPr>
-        <w:t xml:space="preserve">  und „Send File“ </w:t>
-      </w:r>
-      <w:r>
-        <w:rPr>
-          <w:rFonts w:ascii="Arial" w:hAnsi="Arial" w:cs="Arial"/>
-          <w:b/>
-          <w:sz w:val="24"/>
-          <w:szCs w:val="24"/>
-        </w:rPr>
-        <w:t>NFORM.HEX</w:t>
-      </w:r>
-      <w:r>
-        <w:rPr>
-          <w:rFonts w:ascii="Arial" w:hAnsi="Arial" w:cs="Arial"/>
-          <w:sz w:val="24"/>
-          <w:szCs w:val="24"/>
-        </w:rPr>
-        <w:t xml:space="preserve"> das Format-Programm laden</w:t>
-      </w:r>
-      <w:r>
-        <w:rPr>
-          <w:rFonts w:ascii="Arial" w:hAnsi="Arial" w:cs="Arial"/>
-          <w:sz w:val="24"/>
-          <w:szCs w:val="24"/>
-        </w:rPr>
-        <w:t xml:space="preserve">. Der Monitor meldet </w:t>
-      </w:r>
-      <w:r>
-        <w:rPr>
-          <w:rFonts w:ascii="Arial" w:hAnsi="Arial" w:cs="Arial"/>
-          <w:b/>
-          <w:sz w:val="24"/>
-          <w:szCs w:val="24"/>
-        </w:rPr>
-        <w:t>FF*</w:t>
-      </w:r>
-      <w:r>
-        <w:rPr>
-          <w:rFonts w:ascii="Arial" w:hAnsi="Arial" w:cs="Arial"/>
-          <w:sz w:val="24"/>
-          <w:szCs w:val="24"/>
-        </w:rPr>
-        <w:t xml:space="preserve"> bei erfolgreicher Übertragung.</w:t>
-      </w:r>
-      <w:r>
-        <w:rPr>
-          <w:rFonts w:ascii="Arial" w:hAnsi="Arial" w:cs="Arial"/>
-          <w:sz w:val="24"/>
-          <w:szCs w:val="24"/>
-        </w:rPr>
-        <w:t xml:space="preserve"> </w:t>
-      </w:r>
-      <w:r>
-        <w:rPr>
-          <w:rFonts w:ascii="Arial" w:hAnsi="Arial" w:cs="Arial"/>
-          <w:sz w:val="24"/>
-          <w:szCs w:val="24"/>
-        </w:rPr>
-        <w:t xml:space="preserve">Dann eine Diskette in Drive 0 (Laufwerk A) einlegen </w:t>
-      </w:r>
-      <w:r>
-        <w:rPr>
-          <w:rFonts w:ascii="Arial" w:hAnsi="Arial" w:cs="Arial"/>
-          <w:sz w:val="24"/>
-          <w:szCs w:val="24"/>
-        </w:rPr>
-        <w:t xml:space="preserve">und </w:t>
-      </w:r>
-      <w:r>
-        <w:rPr>
-          <w:rFonts w:ascii="Arial" w:hAnsi="Arial" w:cs="Arial"/>
-          <w:sz w:val="24"/>
-          <w:szCs w:val="24"/>
-        </w:rPr>
-        <w:t xml:space="preserve">mit </w:t>
-      </w:r>
-      <w:r>
-        <w:rPr>
-          <w:rFonts w:ascii="Arial" w:hAnsi="Arial" w:cs="Arial"/>
-          <w:b/>
-          <w:sz w:val="24"/>
-          <w:szCs w:val="24"/>
-        </w:rPr>
-        <w:t>g100</w:t>
-      </w:r>
-      <w:r>
-        <w:rPr>
-          <w:rFonts w:ascii="Arial" w:hAnsi="Arial" w:cs="Arial"/>
-          <w:sz w:val="24"/>
-          <w:szCs w:val="24"/>
-        </w:rPr>
-        <w:t xml:space="preserve"> </w:t>
-      </w:r>
-      <w:r>
-        <w:rPr>
-          <w:rFonts w:ascii="Arial" w:hAnsi="Arial" w:cs="Arial"/>
-          <w:sz w:val="24"/>
-          <w:szCs w:val="24"/>
-        </w:rPr>
-        <w:sym w:font="Wingdings" w:char="F0E0"/>
-      </w:r>
-      <w:r>
-        <w:rPr>
-          <w:rFonts w:ascii="Arial" w:hAnsi="Arial" w:cs="Arial"/>
-          <w:sz w:val="24"/>
-          <w:szCs w:val="24"/>
-        </w:rPr>
-        <w:t xml:space="preserve"> </w:t>
-      </w:r>
-      <w:r>
-        <w:rPr>
-          <w:rFonts w:ascii="Arial" w:hAnsi="Arial" w:cs="Arial"/>
-          <w:b/>
-          <w:sz w:val="24"/>
-          <w:szCs w:val="24"/>
-        </w:rPr>
-        <w:t>Enter</w:t>
-      </w:r>
       <w:r>
         <w:rPr>
           <w:rFonts w:ascii="Arial" w:hAnsi="Arial" w:cs="Arial"/>
@@ -1169,7 +1188,15 @@
           <w:szCs w:val="24"/>
         </w:rPr>
         <w:br/>
-        <w:t>- NDR DD DS 80 Spur (5)</w:t>
+        <w:t>- N</w:t>
+      </w:r>
+      <w:r>
+        <w:rPr>
+          <w:rFonts w:ascii="Arial" w:hAnsi="Arial" w:cs="Arial"/>
+          <w:sz w:val="24"/>
+          <w:szCs w:val="24"/>
+        </w:rPr>
+        <w:t>DR DD DS 80 Spur (5)</w:t>
       </w:r>
       <w:r>
         <w:rPr>
@@ -1178,7 +1205,15 @@
           <w:szCs w:val="24"/>
         </w:rPr>
         <w:br/>
-        <w:t>- FLO2-Maxo/Mini (0C0h) (1)</w:t>
+        <w:t>- FLO2-Maxi</w:t>
+      </w:r>
+      <w:r>
+        <w:rPr>
+          <w:rFonts w:ascii="Arial" w:hAnsi="Arial" w:cs="Arial"/>
+          <w:sz w:val="24"/>
+          <w:szCs w:val="24"/>
+        </w:rPr>
+        <w:t>/Mini (0C0h) (1)</w:t>
       </w:r>
       <w:r>
         <w:rPr>
@@ -1196,6 +1231,21 @@
           <w:szCs w:val="24"/>
         </w:rPr>
         <w:br/>
+      </w:r>
+      <w:r>
+        <w:rPr>
+          <w:rFonts w:ascii="Arial" w:hAnsi="Arial" w:cs="Arial"/>
+          <w:sz w:val="24"/>
+          <w:szCs w:val="24"/>
+        </w:rPr>
+        <w:t xml:space="preserve">- </w:t>
+      </w:r>
+      <w:r>
+        <w:rPr>
+          <w:rFonts w:ascii="Arial" w:hAnsi="Arial" w:cs="Arial"/>
+          <w:sz w:val="24"/>
+          <w:szCs w:val="24"/>
+        </w:rPr>
         <w:t>Starten mit „J“</w:t>
       </w:r>
     </w:p>
@@ -1203,74 +1253,58 @@
       <w:pPr>
         <w:rPr>
           <w:rFonts w:ascii="Arial" w:hAnsi="Arial" w:cs="Arial"/>
-          <w:sz w:val="24"/>
-          <w:szCs w:val="24"/>
-        </w:rPr>
-      </w:pPr>
-      <w:r>
-        <w:rPr>
-          <w:rFonts w:ascii="Arial" w:hAnsi="Arial" w:cs="Arial"/>
-          <w:sz w:val="24"/>
-          <w:szCs w:val="24"/>
-        </w:rPr>
-        <w:t xml:space="preserve">Wenn die Formatierung komplett </w:t>
-      </w:r>
-      <w:proofErr w:type="spellStart"/>
-      <w:r>
-        <w:rPr>
-          <w:rFonts w:ascii="Arial" w:hAnsi="Arial" w:cs="Arial"/>
-          <w:sz w:val="24"/>
-          <w:szCs w:val="24"/>
-        </w:rPr>
-        <w:t>duchgelaufen</w:t>
-      </w:r>
-      <w:proofErr w:type="spellEnd"/>
-      <w:r>
-        <w:rPr>
-          <w:rFonts w:ascii="Arial" w:hAnsi="Arial" w:cs="Arial"/>
-          <w:sz w:val="24"/>
-          <w:szCs w:val="24"/>
-        </w:rPr>
-        <w:t xml:space="preserve"> ist RESET-Taste drücken.</w:t>
-      </w:r>
-    </w:p>
-    <w:p>
-      <w:pPr>
-        <w:rPr>
-          <w:rFonts w:ascii="Arial" w:hAnsi="Arial" w:cs="Arial"/>
-          <w:b/>
-          <w:sz w:val="24"/>
-          <w:szCs w:val="24"/>
-        </w:rPr>
-      </w:pPr>
-    </w:p>
-    <w:p>
-      <w:pPr>
-        <w:rPr>
-          <w:rFonts w:ascii="Arial" w:hAnsi="Arial" w:cs="Arial"/>
-          <w:b/>
-          <w:sz w:val="24"/>
-          <w:szCs w:val="24"/>
-        </w:rPr>
-      </w:pPr>
-    </w:p>
-    <w:p>
-      <w:pPr>
-        <w:rPr>
-          <w:rFonts w:ascii="Arial" w:hAnsi="Arial" w:cs="Arial"/>
-          <w:b/>
-          <w:sz w:val="24"/>
-          <w:szCs w:val="24"/>
-        </w:rPr>
-      </w:pPr>
-      <w:r>
-        <w:rPr>
-          <w:rFonts w:ascii="Arial" w:hAnsi="Arial" w:cs="Arial"/>
-          <w:b/>
+          <w:b/>
+          <w:sz w:val="24"/>
+          <w:szCs w:val="24"/>
+        </w:rPr>
+      </w:pPr>
+      <w:r>
+        <w:rPr>
+          <w:rFonts w:ascii="Arial" w:hAnsi="Arial" w:cs="Arial"/>
           <w:sz w:val="24"/>
           <w:szCs w:val="24"/>
         </w:rPr>
         <w:lastRenderedPageBreak/>
+        <w:t>Wenn die For</w:t>
+      </w:r>
+      <w:r>
+        <w:rPr>
+          <w:rFonts w:ascii="Arial" w:hAnsi="Arial" w:cs="Arial"/>
+          <w:sz w:val="24"/>
+          <w:szCs w:val="24"/>
+        </w:rPr>
+        <w:t xml:space="preserve">matierung komplett duchgelaufen, </w:t>
+      </w:r>
+      <w:r>
+        <w:rPr>
+          <w:rFonts w:ascii="Arial" w:hAnsi="Arial" w:cs="Arial"/>
+          <w:sz w:val="24"/>
+          <w:szCs w:val="24"/>
+        </w:rPr>
+        <w:t>ist RESET-Taste drücken.</w:t>
+      </w:r>
+    </w:p>
+    <w:p>
+      <w:pPr>
+        <w:pStyle w:val="Listenabsatz"/>
+        <w:numPr>
+          <w:ilvl w:val="0"/>
+          <w:numId w:val="2"/>
+        </w:numPr>
+        <w:rPr>
+          <w:rFonts w:ascii="Arial" w:hAnsi="Arial" w:cs="Arial"/>
+          <w:b/>
+          <w:sz w:val="24"/>
+          <w:szCs w:val="24"/>
+        </w:rPr>
+      </w:pPr>
+      <w:r>
+        <w:rPr>
+          <w:rFonts w:ascii="Arial" w:hAnsi="Arial" w:cs="Arial"/>
+          <w:b/>
+          <w:sz w:val="24"/>
+          <w:szCs w:val="24"/>
+        </w:rPr>
         <w:t>Schreiben des CP/M und des BIOS</w:t>
       </w:r>
       <w:r>
@@ -1297,6 +1331,40 @@
           <w:sz w:val="24"/>
           <w:szCs w:val="24"/>
         </w:rPr>
+        <w:t xml:space="preserve">Das </w:t>
+      </w:r>
+      <w:r>
+        <w:rPr>
+          <w:rFonts w:ascii="Arial" w:hAnsi="Arial" w:cs="Arial"/>
+          <w:b/>
+          <w:sz w:val="24"/>
+          <w:szCs w:val="24"/>
+        </w:rPr>
+        <w:t>(+Enter)</w:t>
+      </w:r>
+      <w:r>
+        <w:rPr>
+          <w:rFonts w:ascii="Arial" w:hAnsi="Arial" w:cs="Arial"/>
+          <w:sz w:val="24"/>
+          <w:szCs w:val="24"/>
+        </w:rPr>
+        <w:t xml:space="preserve"> zum Absenden eines Kommandos wird ab jetzt weggelassen.</w:t>
+      </w:r>
+    </w:p>
+    <w:p>
+      <w:pPr>
+        <w:rPr>
+          <w:rFonts w:ascii="Arial" w:hAnsi="Arial" w:cs="Arial"/>
+          <w:sz w:val="24"/>
+          <w:szCs w:val="24"/>
+        </w:rPr>
+      </w:pPr>
+      <w:r>
+        <w:rPr>
+          <w:rFonts w:ascii="Arial" w:hAnsi="Arial" w:cs="Arial"/>
+          <w:sz w:val="24"/>
+          <w:szCs w:val="24"/>
+        </w:rPr>
         <w:t xml:space="preserve">Mit </w:t>
       </w:r>
       <w:r>
@@ -1322,7 +1390,186 @@
           <w:sz w:val="24"/>
           <w:szCs w:val="24"/>
         </w:rPr>
-        <w:sym w:font="Wingdings" w:char="F0E0"/>
+        <w:t xml:space="preserve">und „Send File“ </w:t>
+      </w:r>
+      <w:r>
+        <w:rPr>
+          <w:rFonts w:ascii="Arial" w:hAnsi="Arial" w:cs="Arial"/>
+          <w:b/>
+          <w:sz w:val="24"/>
+          <w:szCs w:val="24"/>
+        </w:rPr>
+        <w:t>CPM22</w:t>
+      </w:r>
+      <w:r>
+        <w:rPr>
+          <w:rFonts w:ascii="Arial" w:hAnsi="Arial" w:cs="Arial"/>
+          <w:b/>
+          <w:sz w:val="24"/>
+          <w:szCs w:val="24"/>
+        </w:rPr>
+        <w:t>.HEX</w:t>
+      </w:r>
+      <w:r>
+        <w:rPr>
+          <w:rFonts w:ascii="Arial" w:hAnsi="Arial" w:cs="Arial"/>
+          <w:sz w:val="24"/>
+          <w:szCs w:val="24"/>
+        </w:rPr>
+        <w:t xml:space="preserve"> das CP/M-System auf Adresse CC00h laden.</w:t>
+      </w:r>
+    </w:p>
+    <w:p>
+      <w:pPr>
+        <w:rPr>
+          <w:rFonts w:ascii="Arial" w:hAnsi="Arial" w:cs="Arial"/>
+          <w:sz w:val="24"/>
+          <w:szCs w:val="24"/>
+        </w:rPr>
+      </w:pPr>
+      <w:r>
+        <w:rPr>
+          <w:rFonts w:ascii="Arial" w:hAnsi="Arial" w:cs="Arial"/>
+          <w:sz w:val="24"/>
+          <w:szCs w:val="24"/>
+        </w:rPr>
+        <w:t xml:space="preserve">Mit </w:t>
+      </w:r>
+      <w:r>
+        <w:rPr>
+          <w:rFonts w:ascii="Arial" w:hAnsi="Arial" w:cs="Arial"/>
+          <w:b/>
+          <w:sz w:val="24"/>
+          <w:szCs w:val="24"/>
+        </w:rPr>
+        <w:t>re200</w:t>
+      </w:r>
+      <w:r>
+        <w:rPr>
+          <w:rFonts w:ascii="Arial" w:hAnsi="Arial" w:cs="Arial"/>
+          <w:sz w:val="24"/>
+          <w:szCs w:val="24"/>
+        </w:rPr>
+        <w:t xml:space="preserve"> und „Send File“ </w:t>
+      </w:r>
+      <w:r>
+        <w:rPr>
+          <w:rFonts w:ascii="Arial" w:hAnsi="Arial" w:cs="Arial"/>
+          <w:b/>
+          <w:sz w:val="24"/>
+          <w:szCs w:val="24"/>
+        </w:rPr>
+        <w:t>NBIOS10</w:t>
+      </w:r>
+      <w:r>
+        <w:rPr>
+          <w:rFonts w:ascii="Arial" w:hAnsi="Arial" w:cs="Arial"/>
+          <w:b/>
+          <w:sz w:val="24"/>
+          <w:szCs w:val="24"/>
+        </w:rPr>
+        <w:t>.HEX</w:t>
+      </w:r>
+      <w:r>
+        <w:rPr>
+          <w:rFonts w:ascii="Arial" w:hAnsi="Arial" w:cs="Arial"/>
+          <w:sz w:val="24"/>
+          <w:szCs w:val="24"/>
+        </w:rPr>
+        <w:t xml:space="preserve"> das BIOS erneut laden auf Adresse E200h laden.</w:t>
+      </w:r>
+    </w:p>
+    <w:p>
+      <w:pPr>
+        <w:rPr>
+          <w:rFonts w:ascii="Arial" w:hAnsi="Arial" w:cs="Arial"/>
+          <w:sz w:val="24"/>
+          <w:szCs w:val="24"/>
+        </w:rPr>
+      </w:pPr>
+      <w:r>
+        <w:rPr>
+          <w:rFonts w:ascii="Arial" w:hAnsi="Arial" w:cs="Arial"/>
+          <w:sz w:val="24"/>
+          <w:szCs w:val="24"/>
+        </w:rPr>
+        <w:t xml:space="preserve">Mit </w:t>
+      </w:r>
+      <w:r>
+        <w:rPr>
+          <w:rFonts w:ascii="Arial" w:hAnsi="Arial" w:cs="Arial"/>
+          <w:b/>
+          <w:sz w:val="24"/>
+          <w:szCs w:val="24"/>
+        </w:rPr>
+        <w:t>r100</w:t>
+      </w:r>
+      <w:r>
+        <w:rPr>
+          <w:rFonts w:ascii="Arial" w:hAnsi="Arial" w:cs="Arial"/>
+          <w:sz w:val="24"/>
+          <w:szCs w:val="24"/>
+        </w:rPr>
+        <w:t xml:space="preserve"> und „Send File“ </w:t>
+      </w:r>
+      <w:r>
+        <w:rPr>
+          <w:rFonts w:ascii="Arial" w:hAnsi="Arial" w:cs="Arial"/>
+          <w:b/>
+          <w:sz w:val="24"/>
+          <w:szCs w:val="24"/>
+        </w:rPr>
+        <w:t>NPUT-SY</w:t>
+      </w:r>
+      <w:r>
+        <w:rPr>
+          <w:rFonts w:ascii="Arial" w:hAnsi="Arial" w:cs="Arial"/>
+          <w:b/>
+          <w:sz w:val="24"/>
+          <w:szCs w:val="24"/>
+        </w:rPr>
+        <w:t>.HEX</w:t>
+      </w:r>
+      <w:r>
+        <w:rPr>
+          <w:rFonts w:ascii="Arial" w:hAnsi="Arial" w:cs="Arial"/>
+          <w:sz w:val="24"/>
+          <w:szCs w:val="24"/>
+        </w:rPr>
+        <w:t xml:space="preserve"> das Schreib</w:t>
+      </w:r>
+      <w:r>
+        <w:rPr>
+          <w:rFonts w:ascii="Arial" w:hAnsi="Arial" w:cs="Arial"/>
+          <w:sz w:val="24"/>
+          <w:szCs w:val="24"/>
+        </w:rPr>
+        <w:t>-Pro</w:t>
+      </w:r>
+      <w:r>
+        <w:rPr>
+          <w:rFonts w:ascii="Arial" w:hAnsi="Arial" w:cs="Arial"/>
+          <w:sz w:val="24"/>
+          <w:szCs w:val="24"/>
+        </w:rPr>
+        <w:t>g</w:t>
+      </w:r>
+      <w:r>
+        <w:rPr>
+          <w:rFonts w:ascii="Arial" w:hAnsi="Arial" w:cs="Arial"/>
+          <w:sz w:val="24"/>
+          <w:szCs w:val="24"/>
+        </w:rPr>
+        <w:t xml:space="preserve">ramm auf Adresse 0100h laden und mit </w:t>
+      </w:r>
+      <w:r>
+        <w:rPr>
+          <w:rFonts w:ascii="Arial" w:hAnsi="Arial" w:cs="Arial"/>
+          <w:b/>
+          <w:sz w:val="24"/>
+          <w:szCs w:val="24"/>
+        </w:rPr>
+        <w:t>g100</w:t>
       </w:r>
       <w:r>
         <w:rPr>
@@ -1335,11 +1582,76 @@
       <w:r>
         <w:rPr>
           <w:rFonts w:ascii="Arial" w:hAnsi="Arial" w:cs="Arial"/>
-          <w:b/>
-          <w:sz w:val="24"/>
-          <w:szCs w:val="24"/>
-        </w:rPr>
-        <w:t>Enter</w:t>
+          <w:sz w:val="24"/>
+          <w:szCs w:val="24"/>
+        </w:rPr>
+        <w:t xml:space="preserve">starten. </w:t>
+      </w:r>
+      <w:r>
+        <w:rPr>
+          <w:rFonts w:ascii="Arial" w:hAnsi="Arial" w:cs="Arial"/>
+          <w:sz w:val="24"/>
+          <w:szCs w:val="24"/>
+        </w:rPr>
+        <w:t xml:space="preserve">CP/M und BIOS </w:t>
+      </w:r>
+      <w:r>
+        <w:rPr>
+          <w:rFonts w:ascii="Arial" w:hAnsi="Arial" w:cs="Arial"/>
+          <w:sz w:val="24"/>
+          <w:szCs w:val="24"/>
+        </w:rPr>
+        <w:t>werden auf die System-Spuren der Diskette geschrieben.</w:t>
+      </w:r>
+    </w:p>
+    <w:p>
+      <w:pPr>
+        <w:pStyle w:val="Listenabsatz"/>
+        <w:numPr>
+          <w:ilvl w:val="0"/>
+          <w:numId w:val="2"/>
+        </w:numPr>
+        <w:rPr>
+          <w:rFonts w:ascii="Arial" w:hAnsi="Arial" w:cs="Arial"/>
+          <w:b/>
+          <w:sz w:val="24"/>
+          <w:szCs w:val="24"/>
+        </w:rPr>
+      </w:pPr>
+      <w:r>
+        <w:rPr>
+          <w:rFonts w:ascii="Arial" w:hAnsi="Arial" w:cs="Arial"/>
+          <w:b/>
+          <w:sz w:val="24"/>
+          <w:szCs w:val="24"/>
+        </w:rPr>
+        <w:t>Boot-Sektor schreiben</w:t>
+      </w:r>
+    </w:p>
+    <w:p>
+      <w:pPr>
+        <w:rPr>
+          <w:rFonts w:ascii="Arial" w:hAnsi="Arial" w:cs="Arial"/>
+          <w:sz w:val="24"/>
+          <w:szCs w:val="24"/>
+        </w:rPr>
+      </w:pPr>
+      <w:r>
+        <w:rPr>
+          <w:rFonts w:ascii="Arial" w:hAnsi="Arial" w:cs="Arial"/>
+          <w:sz w:val="24"/>
+          <w:szCs w:val="24"/>
+        </w:rPr>
+        <w:t xml:space="preserve">Mit </w:t>
+      </w:r>
+      <w:r>
+        <w:rPr>
+          <w:rFonts w:ascii="Arial" w:hAnsi="Arial" w:cs="Arial"/>
+          <w:b/>
+          <w:sz w:val="24"/>
+          <w:szCs w:val="24"/>
+        </w:rPr>
+        <w:t>r1000</w:t>
       </w:r>
       <w:r>
         <w:rPr>
@@ -1356,7 +1668,16 @@
           <w:sz w:val="24"/>
           <w:szCs w:val="24"/>
         </w:rPr>
-        <w:t>CPM22</w:t>
+        <w:t>N</w:t>
+      </w:r>
+      <w:r>
+        <w:rPr>
+          <w:rFonts w:ascii="Arial" w:hAnsi="Arial" w:cs="Arial"/>
+          <w:b/>
+          <w:sz w:val="24"/>
+          <w:szCs w:val="24"/>
+        </w:rPr>
+        <w:t>BOOT</w:t>
       </w:r>
       <w:r>
         <w:rPr>
@@ -1373,7 +1694,7 @@
           <w:sz w:val="24"/>
           <w:szCs w:val="24"/>
         </w:rPr>
-        <w:t xml:space="preserve"> das CP/M-System auf Adresse CC00h laden.</w:t>
+        <w:t xml:space="preserve"> den Boot-Sektor auf die Adresse 1000h laden. </w:t>
       </w:r>
     </w:p>
     <w:p>
@@ -1399,7 +1720,7 @@
           <w:sz w:val="24"/>
           <w:szCs w:val="24"/>
         </w:rPr>
-        <w:t>re200</w:t>
+        <w:t>r100</w:t>
       </w:r>
       <w:r>
         <w:rPr>
@@ -1415,7 +1736,76 @@
           <w:sz w:val="24"/>
           <w:szCs w:val="24"/>
         </w:rPr>
-        <w:sym w:font="Wingdings" w:char="F0E0"/>
+        <w:t xml:space="preserve">und „Send File“ </w:t>
+      </w:r>
+      <w:r>
+        <w:rPr>
+          <w:rFonts w:ascii="Arial" w:hAnsi="Arial" w:cs="Arial"/>
+          <w:b/>
+          <w:sz w:val="24"/>
+          <w:szCs w:val="24"/>
+        </w:rPr>
+        <w:t>N</w:t>
+      </w:r>
+      <w:r>
+        <w:rPr>
+          <w:rFonts w:ascii="Arial" w:hAnsi="Arial" w:cs="Arial"/>
+          <w:b/>
+          <w:sz w:val="24"/>
+          <w:szCs w:val="24"/>
+        </w:rPr>
+        <w:t>PUT</w:t>
+      </w:r>
+      <w:r>
+        <w:rPr>
+          <w:rFonts w:ascii="Arial" w:hAnsi="Arial" w:cs="Arial"/>
+          <w:b/>
+          <w:sz w:val="24"/>
+          <w:szCs w:val="24"/>
+        </w:rPr>
+        <w:t>BOOT</w:t>
+      </w:r>
+      <w:r>
+        <w:rPr>
+          <w:rFonts w:ascii="Arial" w:hAnsi="Arial" w:cs="Arial"/>
+          <w:b/>
+          <w:sz w:val="24"/>
+          <w:szCs w:val="24"/>
+        </w:rPr>
+        <w:t>.HEX</w:t>
+      </w:r>
+      <w:r>
+        <w:rPr>
+          <w:rFonts w:ascii="Arial" w:hAnsi="Arial" w:cs="Arial"/>
+          <w:sz w:val="24"/>
+          <w:szCs w:val="24"/>
+        </w:rPr>
+        <w:t xml:space="preserve"> das Boot-Sektor-Schreib-Programm auf Adresse </w:t>
+      </w:r>
+      <w:r>
+        <w:rPr>
+          <w:rFonts w:ascii="Arial" w:hAnsi="Arial" w:cs="Arial"/>
+          <w:sz w:val="24"/>
+          <w:szCs w:val="24"/>
+        </w:rPr>
+        <w:t>100h</w:t>
+      </w:r>
+      <w:r>
+        <w:rPr>
+          <w:rFonts w:ascii="Arial" w:hAnsi="Arial" w:cs="Arial"/>
+          <w:sz w:val="24"/>
+          <w:szCs w:val="24"/>
+        </w:rPr>
+        <w:t xml:space="preserve"> laden und mit </w:t>
+      </w:r>
+      <w:r>
+        <w:rPr>
+          <w:rFonts w:ascii="Arial" w:hAnsi="Arial" w:cs="Arial"/>
+          <w:b/>
+          <w:sz w:val="24"/>
+          <w:szCs w:val="24"/>
+        </w:rPr>
+        <w:t>g100</w:t>
       </w:r>
       <w:r>
         <w:rPr>
@@ -1428,11 +1818,157 @@
       <w:r>
         <w:rPr>
           <w:rFonts w:ascii="Arial" w:hAnsi="Arial" w:cs="Arial"/>
-          <w:b/>
-          <w:sz w:val="24"/>
-          <w:szCs w:val="24"/>
-        </w:rPr>
-        <w:t>Enter</w:t>
+          <w:sz w:val="24"/>
+          <w:szCs w:val="24"/>
+        </w:rPr>
+        <w:t xml:space="preserve">starten. Der Boot-Sektor wird </w:t>
+      </w:r>
+      <w:r>
+        <w:rPr>
+          <w:rFonts w:ascii="Arial" w:hAnsi="Arial" w:cs="Arial"/>
+          <w:sz w:val="24"/>
+          <w:szCs w:val="24"/>
+        </w:rPr>
+        <w:t xml:space="preserve">auf Diskette </w:t>
+      </w:r>
+      <w:r>
+        <w:rPr>
+          <w:rFonts w:ascii="Arial" w:hAnsi="Arial" w:cs="Arial"/>
+          <w:sz w:val="24"/>
+          <w:szCs w:val="24"/>
+        </w:rPr>
+        <w:t xml:space="preserve">geschrieben. </w:t>
+      </w:r>
+    </w:p>
+    <w:p>
+      <w:pPr>
+        <w:rPr>
+          <w:rFonts w:ascii="Arial" w:hAnsi="Arial" w:cs="Arial"/>
+          <w:sz w:val="24"/>
+          <w:szCs w:val="24"/>
+        </w:rPr>
+      </w:pPr>
+      <w:r>
+        <w:rPr>
+          <w:rFonts w:ascii="Arial" w:hAnsi="Arial" w:cs="Arial"/>
+          <w:sz w:val="24"/>
+          <w:szCs w:val="24"/>
+        </w:rPr>
+        <w:t>D</w:t>
+      </w:r>
+      <w:r>
+        <w:rPr>
+          <w:rFonts w:ascii="Arial" w:hAnsi="Arial" w:cs="Arial"/>
+          <w:sz w:val="24"/>
+          <w:szCs w:val="24"/>
+        </w:rPr>
+        <w:t xml:space="preserve">ie Diskette </w:t>
+      </w:r>
+      <w:r>
+        <w:rPr>
+          <w:rFonts w:ascii="Arial" w:hAnsi="Arial" w:cs="Arial"/>
+          <w:sz w:val="24"/>
+          <w:szCs w:val="24"/>
+        </w:rPr>
+        <w:t xml:space="preserve">ist jetzt bootfähig und enthält das CP/M System. Nach eine Reset kann </w:t>
+      </w:r>
+      <w:r>
+        <w:rPr>
+          <w:rFonts w:ascii="Arial" w:hAnsi="Arial" w:cs="Arial"/>
+          <w:sz w:val="24"/>
+          <w:szCs w:val="24"/>
+        </w:rPr>
+        <w:t xml:space="preserve">sie </w:t>
+      </w:r>
+      <w:r>
+        <w:rPr>
+          <w:rFonts w:ascii="Arial" w:hAnsi="Arial" w:cs="Arial"/>
+          <w:sz w:val="24"/>
+          <w:szCs w:val="24"/>
+        </w:rPr>
+        <w:t xml:space="preserve">über den Monitor gebootet werden (Kommando „I“ </w:t>
+      </w:r>
+      <w:r>
+        <w:rPr>
+          <w:rFonts w:ascii="Arial" w:hAnsi="Arial" w:cs="Arial"/>
+          <w:sz w:val="24"/>
+          <w:szCs w:val="24"/>
+        </w:rPr>
+        <w:t xml:space="preserve">im Monitor </w:t>
+      </w:r>
+      <w:r>
+        <w:rPr>
+          <w:rFonts w:ascii="Arial" w:hAnsi="Arial" w:cs="Arial"/>
+          <w:sz w:val="24"/>
+          <w:szCs w:val="24"/>
+        </w:rPr>
+        <w:t xml:space="preserve">und </w:t>
+      </w:r>
+      <w:r>
+        <w:rPr>
+          <w:rFonts w:ascii="Arial" w:hAnsi="Arial" w:cs="Arial"/>
+          <w:sz w:val="24"/>
+          <w:szCs w:val="24"/>
+        </w:rPr>
+        <w:t>das entsprechende</w:t>
+      </w:r>
+      <w:r>
+        <w:rPr>
+          <w:rFonts w:ascii="Arial" w:hAnsi="Arial" w:cs="Arial"/>
+          <w:sz w:val="24"/>
+          <w:szCs w:val="24"/>
+        </w:rPr>
+        <w:t xml:space="preserve"> Medium wählen).</w:t>
+      </w:r>
+    </w:p>
+    <w:p>
+      <w:pPr>
+        <w:pStyle w:val="Listenabsatz"/>
+        <w:numPr>
+          <w:ilvl w:val="0"/>
+          <w:numId w:val="2"/>
+        </w:numPr>
+        <w:rPr>
+          <w:rFonts w:ascii="Arial" w:hAnsi="Arial" w:cs="Arial"/>
+          <w:b/>
+          <w:sz w:val="24"/>
+          <w:szCs w:val="24"/>
+        </w:rPr>
+      </w:pPr>
+      <w:r>
+        <w:rPr>
+          <w:rFonts w:ascii="Arial" w:hAnsi="Arial" w:cs="Arial"/>
+          <w:b/>
+          <w:sz w:val="24"/>
+          <w:szCs w:val="24"/>
+        </w:rPr>
+        <w:t>Das Programm NPCGET übertragen</w:t>
+      </w:r>
+    </w:p>
+    <w:p>
+      <w:pPr>
+        <w:rPr>
+          <w:rFonts w:ascii="Arial" w:hAnsi="Arial" w:cs="Arial"/>
+          <w:sz w:val="24"/>
+          <w:szCs w:val="24"/>
+        </w:rPr>
+      </w:pPr>
+      <w:r>
+        <w:rPr>
+          <w:rFonts w:ascii="Arial" w:hAnsi="Arial" w:cs="Arial"/>
+          <w:sz w:val="24"/>
+          <w:szCs w:val="24"/>
+        </w:rPr>
+        <w:t xml:space="preserve">Mit </w:t>
+      </w:r>
+      <w:r>
+        <w:rPr>
+          <w:rFonts w:ascii="Arial" w:hAnsi="Arial" w:cs="Arial"/>
+          <w:b/>
+          <w:sz w:val="24"/>
+          <w:szCs w:val="24"/>
+        </w:rPr>
+        <w:t>r100</w:t>
       </w:r>
       <w:r>
         <w:rPr>
@@ -1445,11 +1981,28 @@
       <w:r>
         <w:rPr>
           <w:rFonts w:ascii="Arial" w:hAnsi="Arial" w:cs="Arial"/>
-          <w:b/>
-          <w:sz w:val="24"/>
-          <w:szCs w:val="24"/>
-        </w:rPr>
-        <w:t>NBIOS10</w:t>
+          <w:sz w:val="24"/>
+          <w:szCs w:val="24"/>
+        </w:rPr>
+        <w:t xml:space="preserve">das Programm </w:t>
+      </w:r>
+      <w:r>
+        <w:rPr>
+          <w:rFonts w:ascii="Arial" w:hAnsi="Arial" w:cs="Arial"/>
+          <w:b/>
+          <w:sz w:val="24"/>
+          <w:szCs w:val="24"/>
+        </w:rPr>
+        <w:t>N</w:t>
+      </w:r>
+      <w:r>
+        <w:rPr>
+          <w:rFonts w:ascii="Arial" w:hAnsi="Arial" w:cs="Arial"/>
+          <w:b/>
+          <w:sz w:val="24"/>
+          <w:szCs w:val="24"/>
+        </w:rPr>
+        <w:t>PCGET</w:t>
       </w:r>
       <w:r>
         <w:rPr>
@@ -1466,7 +2019,74 @@
           <w:sz w:val="24"/>
           <w:szCs w:val="24"/>
         </w:rPr>
-        <w:t xml:space="preserve"> das BIOS erneut laden auf Adresse E200h laden.</w:t>
+        <w:t xml:space="preserve"> auf Adresse </w:t>
+      </w:r>
+      <w:r>
+        <w:rPr>
+          <w:rFonts w:ascii="Arial" w:hAnsi="Arial" w:cs="Arial"/>
+          <w:sz w:val="24"/>
+          <w:szCs w:val="24"/>
+        </w:rPr>
+        <w:t>100h</w:t>
+      </w:r>
+      <w:r>
+        <w:rPr>
+          <w:rFonts w:ascii="Arial" w:hAnsi="Arial" w:cs="Arial"/>
+          <w:sz w:val="24"/>
+          <w:szCs w:val="24"/>
+        </w:rPr>
+        <w:t xml:space="preserve"> laden.</w:t>
+      </w:r>
+    </w:p>
+    <w:p>
+      <w:pPr>
+        <w:rPr>
+          <w:rFonts w:ascii="Arial" w:hAnsi="Arial" w:cs="Arial"/>
+          <w:sz w:val="24"/>
+          <w:szCs w:val="24"/>
+        </w:rPr>
+      </w:pPr>
+      <w:r>
+        <w:rPr>
+          <w:rFonts w:ascii="Arial" w:hAnsi="Arial" w:cs="Arial"/>
+          <w:sz w:val="24"/>
+          <w:szCs w:val="24"/>
+        </w:rPr>
+        <w:t>Dann RESET-Taste drücken (nicht ausschalten) und mit „</w:t>
+      </w:r>
+      <w:r>
+        <w:rPr>
+          <w:rFonts w:ascii="Arial" w:hAnsi="Arial" w:cs="Arial"/>
+          <w:b/>
+          <w:sz w:val="24"/>
+          <w:szCs w:val="24"/>
+        </w:rPr>
+        <w:t>I</w:t>
+      </w:r>
+      <w:r>
+        <w:rPr>
+          <w:rFonts w:ascii="Arial" w:hAnsi="Arial" w:cs="Arial"/>
+          <w:sz w:val="24"/>
+          <w:szCs w:val="24"/>
+        </w:rPr>
+        <w:t>“ vom IDE/CF-Medium booten. NPCGET.HEX befindet sich immer noch im Speicher und kann mit dem CP/M-Kommando „</w:t>
+      </w:r>
+      <w:r>
+        <w:rPr>
+          <w:rFonts w:ascii="Arial" w:hAnsi="Arial" w:cs="Arial"/>
+          <w:b/>
+          <w:sz w:val="24"/>
+          <w:szCs w:val="24"/>
+        </w:rPr>
+        <w:t>save 5 npcget.com</w:t>
+      </w:r>
+      <w:r>
+        <w:rPr>
+          <w:rFonts w:ascii="Arial" w:hAnsi="Arial" w:cs="Arial"/>
+          <w:sz w:val="24"/>
+          <w:szCs w:val="24"/>
+        </w:rPr>
+        <w:t>“ auf dem Medium gespeichert werden.</w:t>
       </w:r>
     </w:p>
     <w:p>
@@ -1492,266 +2112,6 @@
           <w:sz w:val="24"/>
           <w:szCs w:val="24"/>
         </w:rPr>
-        <w:t>r100</w:t>
-      </w:r>
-      <w:r>
-        <w:rPr>
-          <w:rFonts w:ascii="Arial" w:hAnsi="Arial" w:cs="Arial"/>
-          <w:sz w:val="24"/>
-          <w:szCs w:val="24"/>
-        </w:rPr>
-        <w:t xml:space="preserve"> </w:t>
-      </w:r>
-      <w:r>
-        <w:rPr>
-          <w:rFonts w:ascii="Arial" w:hAnsi="Arial" w:cs="Arial"/>
-          <w:sz w:val="24"/>
-          <w:szCs w:val="24"/>
-        </w:rPr>
-        <w:sym w:font="Wingdings" w:char="F0E0"/>
-      </w:r>
-      <w:r>
-        <w:rPr>
-          <w:rFonts w:ascii="Arial" w:hAnsi="Arial" w:cs="Arial"/>
-          <w:sz w:val="24"/>
-          <w:szCs w:val="24"/>
-        </w:rPr>
-        <w:t xml:space="preserve"> </w:t>
-      </w:r>
-      <w:r>
-        <w:rPr>
-          <w:rFonts w:ascii="Arial" w:hAnsi="Arial" w:cs="Arial"/>
-          <w:b/>
-          <w:sz w:val="24"/>
-          <w:szCs w:val="24"/>
-        </w:rPr>
-        <w:t>Enter</w:t>
-      </w:r>
-      <w:r>
-        <w:rPr>
-          <w:rFonts w:ascii="Arial" w:hAnsi="Arial" w:cs="Arial"/>
-          <w:sz w:val="24"/>
-          <w:szCs w:val="24"/>
-        </w:rPr>
-        <w:t xml:space="preserve"> und „Send File“ </w:t>
-      </w:r>
-      <w:r>
-        <w:rPr>
-          <w:rFonts w:ascii="Arial" w:hAnsi="Arial" w:cs="Arial"/>
-          <w:b/>
-          <w:sz w:val="24"/>
-          <w:szCs w:val="24"/>
-        </w:rPr>
-        <w:t>NPUT-SY</w:t>
-      </w:r>
-      <w:r>
-        <w:rPr>
-          <w:rFonts w:ascii="Arial" w:hAnsi="Arial" w:cs="Arial"/>
-          <w:b/>
-          <w:sz w:val="24"/>
-          <w:szCs w:val="24"/>
-        </w:rPr>
-        <w:t>.HEX</w:t>
-      </w:r>
-      <w:r>
-        <w:rPr>
-          <w:rFonts w:ascii="Arial" w:hAnsi="Arial" w:cs="Arial"/>
-          <w:sz w:val="24"/>
-          <w:szCs w:val="24"/>
-        </w:rPr>
-        <w:t xml:space="preserve"> das Schreib</w:t>
-      </w:r>
-      <w:r>
-        <w:rPr>
-          <w:rFonts w:ascii="Arial" w:hAnsi="Arial" w:cs="Arial"/>
-          <w:sz w:val="24"/>
-          <w:szCs w:val="24"/>
-        </w:rPr>
-        <w:t>-Pro</w:t>
-      </w:r>
-      <w:r>
-        <w:rPr>
-          <w:rFonts w:ascii="Arial" w:hAnsi="Arial" w:cs="Arial"/>
-          <w:sz w:val="24"/>
-          <w:szCs w:val="24"/>
-        </w:rPr>
-        <w:t>g</w:t>
-      </w:r>
-      <w:r>
-        <w:rPr>
-          <w:rFonts w:ascii="Arial" w:hAnsi="Arial" w:cs="Arial"/>
-          <w:sz w:val="24"/>
-          <w:szCs w:val="24"/>
-        </w:rPr>
-        <w:t xml:space="preserve">ramm auf Adresse 0100h laden und mit </w:t>
-      </w:r>
-      <w:r>
-        <w:rPr>
-          <w:rFonts w:ascii="Arial" w:hAnsi="Arial" w:cs="Arial"/>
-          <w:b/>
-          <w:sz w:val="24"/>
-          <w:szCs w:val="24"/>
-        </w:rPr>
-        <w:t>g100</w:t>
-      </w:r>
-      <w:r>
-        <w:rPr>
-          <w:rFonts w:ascii="Arial" w:hAnsi="Arial" w:cs="Arial"/>
-          <w:sz w:val="24"/>
-          <w:szCs w:val="24"/>
-        </w:rPr>
-        <w:t xml:space="preserve"> </w:t>
-      </w:r>
-      <w:r>
-        <w:rPr>
-          <w:rFonts w:ascii="Arial" w:hAnsi="Arial" w:cs="Arial"/>
-          <w:sz w:val="24"/>
-          <w:szCs w:val="24"/>
-        </w:rPr>
-        <w:sym w:font="Wingdings" w:char="F0E0"/>
-      </w:r>
-      <w:r>
-        <w:rPr>
-          <w:rFonts w:ascii="Arial" w:hAnsi="Arial" w:cs="Arial"/>
-          <w:sz w:val="24"/>
-          <w:szCs w:val="24"/>
-        </w:rPr>
-        <w:t xml:space="preserve"> </w:t>
-      </w:r>
-      <w:r>
-        <w:rPr>
-          <w:rFonts w:ascii="Arial" w:hAnsi="Arial" w:cs="Arial"/>
-          <w:b/>
-          <w:sz w:val="24"/>
-          <w:szCs w:val="24"/>
-        </w:rPr>
-        <w:t>Enter</w:t>
-      </w:r>
-      <w:r>
-        <w:rPr>
-          <w:rFonts w:ascii="Arial" w:hAnsi="Arial" w:cs="Arial"/>
-          <w:sz w:val="24"/>
-          <w:szCs w:val="24"/>
-        </w:rPr>
-        <w:t xml:space="preserve"> </w:t>
-      </w:r>
-      <w:r>
-        <w:rPr>
-          <w:rFonts w:ascii="Arial" w:hAnsi="Arial" w:cs="Arial"/>
-          <w:sz w:val="24"/>
-          <w:szCs w:val="24"/>
-        </w:rPr>
-        <w:t xml:space="preserve">starten. </w:t>
-      </w:r>
-      <w:r>
-        <w:rPr>
-          <w:rFonts w:ascii="Arial" w:hAnsi="Arial" w:cs="Arial"/>
-          <w:sz w:val="24"/>
-          <w:szCs w:val="24"/>
-        </w:rPr>
-        <w:t xml:space="preserve">CP/M und BIOS </w:t>
-      </w:r>
-      <w:r>
-        <w:rPr>
-          <w:rFonts w:ascii="Arial" w:hAnsi="Arial" w:cs="Arial"/>
-          <w:sz w:val="24"/>
-          <w:szCs w:val="24"/>
-        </w:rPr>
-        <w:t>werden auf die System-Spuren der Diskette geschrieben.</w:t>
-      </w:r>
-    </w:p>
-    <w:p>
-      <w:pPr>
-        <w:rPr>
-          <w:rFonts w:ascii="Arial" w:hAnsi="Arial" w:cs="Arial"/>
-          <w:b/>
-          <w:sz w:val="24"/>
-          <w:szCs w:val="24"/>
-        </w:rPr>
-      </w:pPr>
-      <w:r>
-        <w:rPr>
-          <w:rFonts w:ascii="Arial" w:hAnsi="Arial" w:cs="Arial"/>
-          <w:b/>
-          <w:sz w:val="24"/>
-          <w:szCs w:val="24"/>
-        </w:rPr>
-        <w:t>Boot-Sektor schreiben</w:t>
-      </w:r>
-    </w:p>
-    <w:p>
-      <w:pPr>
-        <w:rPr>
-          <w:rFonts w:ascii="Arial" w:hAnsi="Arial" w:cs="Arial"/>
-          <w:sz w:val="24"/>
-          <w:szCs w:val="24"/>
-        </w:rPr>
-      </w:pPr>
-      <w:r>
-        <w:rPr>
-          <w:rFonts w:ascii="Arial" w:hAnsi="Arial" w:cs="Arial"/>
-          <w:sz w:val="24"/>
-          <w:szCs w:val="24"/>
-        </w:rPr>
-        <w:t xml:space="preserve">Mit </w:t>
-      </w:r>
-      <w:r>
-        <w:rPr>
-          <w:rFonts w:ascii="Arial" w:hAnsi="Arial" w:cs="Arial"/>
-          <w:b/>
-          <w:sz w:val="24"/>
-          <w:szCs w:val="24"/>
-        </w:rPr>
-        <w:t>r1000</w:t>
-      </w:r>
-      <w:r>
-        <w:rPr>
-          <w:rFonts w:ascii="Arial" w:hAnsi="Arial" w:cs="Arial"/>
-          <w:sz w:val="24"/>
-          <w:szCs w:val="24"/>
-        </w:rPr>
-        <w:t xml:space="preserve"> </w:t>
-      </w:r>
-      <w:r>
-        <w:rPr>
-          <w:rFonts w:ascii="Arial" w:hAnsi="Arial" w:cs="Arial"/>
-          <w:sz w:val="24"/>
-          <w:szCs w:val="24"/>
-        </w:rPr>
-        <w:sym w:font="Wingdings" w:char="F0E0"/>
-      </w:r>
-      <w:r>
-        <w:rPr>
-          <w:rFonts w:ascii="Arial" w:hAnsi="Arial" w:cs="Arial"/>
-          <w:sz w:val="24"/>
-          <w:szCs w:val="24"/>
-        </w:rPr>
-        <w:t xml:space="preserve"> </w:t>
-      </w:r>
-      <w:r>
-        <w:rPr>
-          <w:rFonts w:ascii="Arial" w:hAnsi="Arial" w:cs="Arial"/>
-          <w:b/>
-          <w:sz w:val="24"/>
-          <w:szCs w:val="24"/>
-        </w:rPr>
-        <w:t>Enter</w:t>
-      </w:r>
-      <w:r>
-        <w:rPr>
-          <w:rFonts w:ascii="Arial" w:hAnsi="Arial" w:cs="Arial"/>
-          <w:sz w:val="24"/>
-          <w:szCs w:val="24"/>
-        </w:rPr>
-        <w:t xml:space="preserve"> und „Send File“ </w:t>
-      </w:r>
-      <w:r>
-        <w:rPr>
-          <w:rFonts w:ascii="Arial" w:hAnsi="Arial" w:cs="Arial"/>
-          <w:b/>
-          <w:sz w:val="24"/>
-          <w:szCs w:val="24"/>
-        </w:rPr>
         <w:t>N</w:t>
       </w:r>
       <w:r>
@@ -1761,484 +2121,6 @@
           <w:sz w:val="24"/>
           <w:szCs w:val="24"/>
         </w:rPr>
-        <w:t>BOOT</w:t>
-      </w:r>
-      <w:r>
-        <w:rPr>
-          <w:rFonts w:ascii="Arial" w:hAnsi="Arial" w:cs="Arial"/>
-          <w:b/>
-          <w:sz w:val="24"/>
-          <w:szCs w:val="24"/>
-        </w:rPr>
-        <w:t>.HEX</w:t>
-      </w:r>
-      <w:r>
-        <w:rPr>
-          <w:rFonts w:ascii="Arial" w:hAnsi="Arial" w:cs="Arial"/>
-          <w:sz w:val="24"/>
-          <w:szCs w:val="24"/>
-        </w:rPr>
-        <w:t xml:space="preserve"> den Boot-Sektor auf die Adresse 1000h laden. </w:t>
-      </w:r>
-    </w:p>
-    <w:p>
-      <w:pPr>
-        <w:rPr>
-          <w:rFonts w:ascii="Arial" w:hAnsi="Arial" w:cs="Arial"/>
-          <w:sz w:val="24"/>
-          <w:szCs w:val="24"/>
-        </w:rPr>
-      </w:pPr>
-      <w:r>
-        <w:rPr>
-          <w:rFonts w:ascii="Arial" w:hAnsi="Arial" w:cs="Arial"/>
-          <w:sz w:val="24"/>
-          <w:szCs w:val="24"/>
-        </w:rPr>
-        <w:t xml:space="preserve">Mit </w:t>
-      </w:r>
-      <w:r>
-        <w:rPr>
-          <w:rFonts w:ascii="Arial" w:hAnsi="Arial" w:cs="Arial"/>
-          <w:b/>
-          <w:sz w:val="24"/>
-          <w:szCs w:val="24"/>
-        </w:rPr>
-        <w:t>r100</w:t>
-      </w:r>
-      <w:r>
-        <w:rPr>
-          <w:rFonts w:ascii="Arial" w:hAnsi="Arial" w:cs="Arial"/>
-          <w:sz w:val="24"/>
-          <w:szCs w:val="24"/>
-        </w:rPr>
-        <w:t xml:space="preserve"> </w:t>
-      </w:r>
-      <w:r>
-        <w:rPr>
-          <w:rFonts w:ascii="Arial" w:hAnsi="Arial" w:cs="Arial"/>
-          <w:sz w:val="24"/>
-          <w:szCs w:val="24"/>
-        </w:rPr>
-        <w:sym w:font="Wingdings" w:char="F0E0"/>
-      </w:r>
-      <w:r>
-        <w:rPr>
-          <w:rFonts w:ascii="Arial" w:hAnsi="Arial" w:cs="Arial"/>
-          <w:sz w:val="24"/>
-          <w:szCs w:val="24"/>
-        </w:rPr>
-        <w:t xml:space="preserve"> </w:t>
-      </w:r>
-      <w:r>
-        <w:rPr>
-          <w:rFonts w:ascii="Arial" w:hAnsi="Arial" w:cs="Arial"/>
-          <w:b/>
-          <w:sz w:val="24"/>
-          <w:szCs w:val="24"/>
-        </w:rPr>
-        <w:t>Enter</w:t>
-      </w:r>
-      <w:r>
-        <w:rPr>
-          <w:rFonts w:ascii="Arial" w:hAnsi="Arial" w:cs="Arial"/>
-          <w:sz w:val="24"/>
-          <w:szCs w:val="24"/>
-        </w:rPr>
-        <w:t xml:space="preserve"> und „Send File“ </w:t>
-      </w:r>
-      <w:r>
-        <w:rPr>
-          <w:rFonts w:ascii="Arial" w:hAnsi="Arial" w:cs="Arial"/>
-          <w:b/>
-          <w:sz w:val="24"/>
-          <w:szCs w:val="24"/>
-        </w:rPr>
-        <w:t>N</w:t>
-      </w:r>
-      <w:r>
-        <w:rPr>
-          <w:rFonts w:ascii="Arial" w:hAnsi="Arial" w:cs="Arial"/>
-          <w:b/>
-          <w:sz w:val="24"/>
-          <w:szCs w:val="24"/>
-        </w:rPr>
-        <w:t>PUT</w:t>
-      </w:r>
-      <w:r>
-        <w:rPr>
-          <w:rFonts w:ascii="Arial" w:hAnsi="Arial" w:cs="Arial"/>
-          <w:b/>
-          <w:sz w:val="24"/>
-          <w:szCs w:val="24"/>
-        </w:rPr>
-        <w:t>BOOT</w:t>
-      </w:r>
-      <w:r>
-        <w:rPr>
-          <w:rFonts w:ascii="Arial" w:hAnsi="Arial" w:cs="Arial"/>
-          <w:b/>
-          <w:sz w:val="24"/>
-          <w:szCs w:val="24"/>
-        </w:rPr>
-        <w:t>.HEX</w:t>
-      </w:r>
-      <w:r>
-        <w:rPr>
-          <w:rFonts w:ascii="Arial" w:hAnsi="Arial" w:cs="Arial"/>
-          <w:sz w:val="24"/>
-          <w:szCs w:val="24"/>
-        </w:rPr>
-        <w:t xml:space="preserve"> das Boot-Sektor-Schreib-Programm auf Adresse 100h laden und mit </w:t>
-      </w:r>
-      <w:r>
-        <w:rPr>
-          <w:rFonts w:ascii="Arial" w:hAnsi="Arial" w:cs="Arial"/>
-          <w:b/>
-          <w:sz w:val="24"/>
-          <w:szCs w:val="24"/>
-        </w:rPr>
-        <w:t>g100</w:t>
-      </w:r>
-      <w:r>
-        <w:rPr>
-          <w:rFonts w:ascii="Arial" w:hAnsi="Arial" w:cs="Arial"/>
-          <w:sz w:val="24"/>
-          <w:szCs w:val="24"/>
-        </w:rPr>
-        <w:t xml:space="preserve"> </w:t>
-      </w:r>
-      <w:r>
-        <w:rPr>
-          <w:rFonts w:ascii="Arial" w:hAnsi="Arial" w:cs="Arial"/>
-          <w:sz w:val="24"/>
-          <w:szCs w:val="24"/>
-        </w:rPr>
-        <w:sym w:font="Wingdings" w:char="F0E0"/>
-      </w:r>
-      <w:r>
-        <w:rPr>
-          <w:rFonts w:ascii="Arial" w:hAnsi="Arial" w:cs="Arial"/>
-          <w:sz w:val="24"/>
-          <w:szCs w:val="24"/>
-        </w:rPr>
-        <w:t xml:space="preserve"> </w:t>
-      </w:r>
-      <w:r>
-        <w:rPr>
-          <w:rFonts w:ascii="Arial" w:hAnsi="Arial" w:cs="Arial"/>
-          <w:b/>
-          <w:sz w:val="24"/>
-          <w:szCs w:val="24"/>
-        </w:rPr>
-        <w:t>Enter</w:t>
-      </w:r>
-      <w:r>
-        <w:rPr>
-          <w:rFonts w:ascii="Arial" w:hAnsi="Arial" w:cs="Arial"/>
-          <w:sz w:val="24"/>
-          <w:szCs w:val="24"/>
-        </w:rPr>
-        <w:t xml:space="preserve"> </w:t>
-      </w:r>
-      <w:r>
-        <w:rPr>
-          <w:rFonts w:ascii="Arial" w:hAnsi="Arial" w:cs="Arial"/>
-          <w:sz w:val="24"/>
-          <w:szCs w:val="24"/>
-        </w:rPr>
-        <w:t xml:space="preserve">starten. Der Boot-Sektor wird geschrieben. </w:t>
-      </w:r>
-    </w:p>
-    <w:p>
-      <w:pPr>
-        <w:rPr>
-          <w:rFonts w:ascii="Arial" w:hAnsi="Arial" w:cs="Arial"/>
-          <w:sz w:val="24"/>
-          <w:szCs w:val="24"/>
-        </w:rPr>
-      </w:pPr>
-      <w:r>
-        <w:rPr>
-          <w:rFonts w:ascii="Arial" w:hAnsi="Arial" w:cs="Arial"/>
-          <w:sz w:val="24"/>
-          <w:szCs w:val="24"/>
-        </w:rPr>
-        <w:t>D</w:t>
-      </w:r>
-      <w:r>
-        <w:rPr>
-          <w:rFonts w:ascii="Arial" w:hAnsi="Arial" w:cs="Arial"/>
-          <w:sz w:val="24"/>
-          <w:szCs w:val="24"/>
-        </w:rPr>
-        <w:t xml:space="preserve">ie Diskette </w:t>
-      </w:r>
-      <w:r>
-        <w:rPr>
-          <w:rFonts w:ascii="Arial" w:hAnsi="Arial" w:cs="Arial"/>
-          <w:sz w:val="24"/>
-          <w:szCs w:val="24"/>
-        </w:rPr>
-        <w:t xml:space="preserve">ist jetzt bootfähig und enthält das CP/M System. Nach </w:t>
-      </w:r>
-      <w:proofErr w:type="gramStart"/>
-      <w:r>
-        <w:rPr>
-          <w:rFonts w:ascii="Arial" w:hAnsi="Arial" w:cs="Arial"/>
-          <w:sz w:val="24"/>
-          <w:szCs w:val="24"/>
-        </w:rPr>
-        <w:t>eine</w:t>
-      </w:r>
-      <w:proofErr w:type="gramEnd"/>
-      <w:r>
-        <w:rPr>
-          <w:rFonts w:ascii="Arial" w:hAnsi="Arial" w:cs="Arial"/>
-          <w:sz w:val="24"/>
-          <w:szCs w:val="24"/>
-        </w:rPr>
-        <w:t xml:space="preserve"> </w:t>
-      </w:r>
-      <w:proofErr w:type="spellStart"/>
-      <w:r>
-        <w:rPr>
-          <w:rFonts w:ascii="Arial" w:hAnsi="Arial" w:cs="Arial"/>
-          <w:sz w:val="24"/>
-          <w:szCs w:val="24"/>
-        </w:rPr>
-        <w:t>Reset</w:t>
-      </w:r>
-      <w:proofErr w:type="spellEnd"/>
-      <w:r>
-        <w:rPr>
-          <w:rFonts w:ascii="Arial" w:hAnsi="Arial" w:cs="Arial"/>
-          <w:sz w:val="24"/>
-          <w:szCs w:val="24"/>
-        </w:rPr>
-        <w:t xml:space="preserve"> kann </w:t>
-      </w:r>
-      <w:r>
-        <w:rPr>
-          <w:rFonts w:ascii="Arial" w:hAnsi="Arial" w:cs="Arial"/>
-          <w:sz w:val="24"/>
-          <w:szCs w:val="24"/>
-        </w:rPr>
-        <w:t xml:space="preserve">sie </w:t>
-      </w:r>
-      <w:r>
-        <w:rPr>
-          <w:rFonts w:ascii="Arial" w:hAnsi="Arial" w:cs="Arial"/>
-          <w:sz w:val="24"/>
-          <w:szCs w:val="24"/>
-        </w:rPr>
-        <w:t>über den Monitor gebootet werden (Kommando „I“ und entsprechendes Medium wählen).</w:t>
-      </w:r>
-    </w:p>
-    <w:p>
-      <w:pPr>
-        <w:rPr>
-          <w:rFonts w:ascii="Arial" w:hAnsi="Arial" w:cs="Arial"/>
-          <w:b/>
-          <w:sz w:val="24"/>
-          <w:szCs w:val="24"/>
-        </w:rPr>
-      </w:pPr>
-      <w:r>
-        <w:rPr>
-          <w:rFonts w:ascii="Arial" w:hAnsi="Arial" w:cs="Arial"/>
-          <w:b/>
-          <w:sz w:val="24"/>
-          <w:szCs w:val="24"/>
-        </w:rPr>
-        <w:t>Das Programm NPCGET übertragen</w:t>
-      </w:r>
-    </w:p>
-    <w:p>
-      <w:pPr>
-        <w:rPr>
-          <w:rFonts w:ascii="Arial" w:hAnsi="Arial" w:cs="Arial"/>
-          <w:sz w:val="24"/>
-          <w:szCs w:val="24"/>
-        </w:rPr>
-      </w:pPr>
-      <w:r>
-        <w:rPr>
-          <w:rFonts w:ascii="Arial" w:hAnsi="Arial" w:cs="Arial"/>
-          <w:sz w:val="24"/>
-          <w:szCs w:val="24"/>
-        </w:rPr>
-        <w:t xml:space="preserve">Mit </w:t>
-      </w:r>
-      <w:r>
-        <w:rPr>
-          <w:rFonts w:ascii="Arial" w:hAnsi="Arial" w:cs="Arial"/>
-          <w:b/>
-          <w:sz w:val="24"/>
-          <w:szCs w:val="24"/>
-        </w:rPr>
-        <w:t>r100</w:t>
-      </w:r>
-      <w:r>
-        <w:rPr>
-          <w:rFonts w:ascii="Arial" w:hAnsi="Arial" w:cs="Arial"/>
-          <w:sz w:val="24"/>
-          <w:szCs w:val="24"/>
-        </w:rPr>
-        <w:t xml:space="preserve"> </w:t>
-      </w:r>
-      <w:r>
-        <w:rPr>
-          <w:rFonts w:ascii="Arial" w:hAnsi="Arial" w:cs="Arial"/>
-          <w:sz w:val="24"/>
-          <w:szCs w:val="24"/>
-        </w:rPr>
-        <w:sym w:font="Wingdings" w:char="F0E0"/>
-      </w:r>
-      <w:r>
-        <w:rPr>
-          <w:rFonts w:ascii="Arial" w:hAnsi="Arial" w:cs="Arial"/>
-          <w:sz w:val="24"/>
-          <w:szCs w:val="24"/>
-        </w:rPr>
-        <w:t xml:space="preserve"> </w:t>
-      </w:r>
-      <w:r>
-        <w:rPr>
-          <w:rFonts w:ascii="Arial" w:hAnsi="Arial" w:cs="Arial"/>
-          <w:b/>
-          <w:sz w:val="24"/>
-          <w:szCs w:val="24"/>
-        </w:rPr>
-        <w:t>Enter</w:t>
-      </w:r>
-      <w:r>
-        <w:rPr>
-          <w:rFonts w:ascii="Arial" w:hAnsi="Arial" w:cs="Arial"/>
-          <w:sz w:val="24"/>
-          <w:szCs w:val="24"/>
-        </w:rPr>
-        <w:t xml:space="preserve"> und „Send File“ </w:t>
-      </w:r>
-      <w:r>
-        <w:rPr>
-          <w:rFonts w:ascii="Arial" w:hAnsi="Arial" w:cs="Arial"/>
-          <w:b/>
-          <w:sz w:val="24"/>
-          <w:szCs w:val="24"/>
-        </w:rPr>
-        <w:t>N</w:t>
-      </w:r>
-      <w:r>
-        <w:rPr>
-          <w:rFonts w:ascii="Arial" w:hAnsi="Arial" w:cs="Arial"/>
-          <w:b/>
-          <w:sz w:val="24"/>
-          <w:szCs w:val="24"/>
-        </w:rPr>
-        <w:t>PCGET</w:t>
-      </w:r>
-      <w:r>
-        <w:rPr>
-          <w:rFonts w:ascii="Arial" w:hAnsi="Arial" w:cs="Arial"/>
-          <w:b/>
-          <w:sz w:val="24"/>
-          <w:szCs w:val="24"/>
-        </w:rPr>
-        <w:t>.HEX</w:t>
-      </w:r>
-      <w:r>
-        <w:rPr>
-          <w:rFonts w:ascii="Arial" w:hAnsi="Arial" w:cs="Arial"/>
-          <w:sz w:val="24"/>
-          <w:szCs w:val="24"/>
-        </w:rPr>
-        <w:t xml:space="preserve"> das Programm auf Adresse 100h laden.</w:t>
-      </w:r>
-    </w:p>
-    <w:p>
-      <w:pPr>
-        <w:rPr>
-          <w:rFonts w:ascii="Arial" w:hAnsi="Arial" w:cs="Arial"/>
-          <w:sz w:val="24"/>
-          <w:szCs w:val="24"/>
-        </w:rPr>
-      </w:pPr>
-      <w:r>
-        <w:rPr>
-          <w:rFonts w:ascii="Arial" w:hAnsi="Arial" w:cs="Arial"/>
-          <w:sz w:val="24"/>
-          <w:szCs w:val="24"/>
-        </w:rPr>
-        <w:t>Dann RESET-Taste drücken (nicht ausschalten) und mit „</w:t>
-      </w:r>
-      <w:r>
-        <w:rPr>
-          <w:rFonts w:ascii="Arial" w:hAnsi="Arial" w:cs="Arial"/>
-          <w:b/>
-          <w:sz w:val="24"/>
-          <w:szCs w:val="24"/>
-        </w:rPr>
-        <w:t>I</w:t>
-      </w:r>
-      <w:r>
-        <w:rPr>
-          <w:rFonts w:ascii="Arial" w:hAnsi="Arial" w:cs="Arial"/>
-          <w:sz w:val="24"/>
-          <w:szCs w:val="24"/>
-        </w:rPr>
-        <w:t>“ vom IDE/CF-Medium booten. NPCGET.HEX befindet sich immer noch im Speicher und kann mit dem CP/M-Kommando „</w:t>
-      </w:r>
-      <w:r>
-        <w:rPr>
-          <w:rFonts w:ascii="Arial" w:hAnsi="Arial" w:cs="Arial"/>
-          <w:b/>
-          <w:sz w:val="24"/>
-          <w:szCs w:val="24"/>
-        </w:rPr>
-        <w:t>save 5 npcget.com</w:t>
-      </w:r>
-      <w:r>
-        <w:rPr>
-          <w:rFonts w:ascii="Arial" w:hAnsi="Arial" w:cs="Arial"/>
-          <w:sz w:val="24"/>
-          <w:szCs w:val="24"/>
-        </w:rPr>
-        <w:t>“ auf dem Medium gespeichert werden.</w:t>
-      </w:r>
-    </w:p>
-    <w:p>
-      <w:pPr>
-        <w:rPr>
-          <w:rFonts w:ascii="Arial" w:hAnsi="Arial" w:cs="Arial"/>
-          <w:sz w:val="24"/>
-          <w:szCs w:val="24"/>
-        </w:rPr>
-      </w:pPr>
-      <w:r>
-        <w:rPr>
-          <w:rFonts w:ascii="Arial" w:hAnsi="Arial" w:cs="Arial"/>
-          <w:sz w:val="24"/>
-          <w:szCs w:val="24"/>
-        </w:rPr>
-        <w:t xml:space="preserve">Mit </w:t>
-      </w:r>
-      <w:r>
-        <w:rPr>
-          <w:rFonts w:ascii="Arial" w:hAnsi="Arial" w:cs="Arial"/>
-          <w:b/>
-          <w:sz w:val="24"/>
-          <w:szCs w:val="24"/>
-        </w:rPr>
-        <w:t>N</w:t>
-      </w:r>
-      <w:r>
-        <w:rPr>
-          <w:rFonts w:ascii="Arial" w:hAnsi="Arial" w:cs="Arial"/>
-          <w:b/>
-          <w:sz w:val="24"/>
-          <w:szCs w:val="24"/>
-        </w:rPr>
         <w:t>PC</w:t>
       </w:r>
       <w:r>
@@ -2256,43 +2138,7 @@
           <w:sz w:val="24"/>
           <w:szCs w:val="24"/>
         </w:rPr>
-        <w:t xml:space="preserve"> können jetzt weitere Programme über das </w:t>
-      </w:r>
-      <w:proofErr w:type="spellStart"/>
-      <w:r>
-        <w:rPr>
-          <w:rFonts w:ascii="Arial" w:hAnsi="Arial" w:cs="Arial"/>
-          <w:sz w:val="24"/>
-          <w:szCs w:val="24"/>
-        </w:rPr>
-        <w:t>Xmodem</w:t>
-      </w:r>
-      <w:proofErr w:type="spellEnd"/>
-      <w:r>
-        <w:rPr>
-          <w:rFonts w:ascii="Arial" w:hAnsi="Arial" w:cs="Arial"/>
-          <w:sz w:val="24"/>
-          <w:szCs w:val="24"/>
-        </w:rPr>
-        <w:t xml:space="preserve">-Protokoll mit </w:t>
-      </w:r>
-      <w:proofErr w:type="spellStart"/>
-      <w:r>
-        <w:rPr>
-          <w:rFonts w:ascii="Arial" w:hAnsi="Arial" w:cs="Arial"/>
-          <w:sz w:val="24"/>
-          <w:szCs w:val="24"/>
-        </w:rPr>
-        <w:t>TeraTerm</w:t>
-      </w:r>
-      <w:proofErr w:type="spellEnd"/>
-      <w:r>
-        <w:rPr>
-          <w:rFonts w:ascii="Arial" w:hAnsi="Arial" w:cs="Arial"/>
-          <w:sz w:val="24"/>
-          <w:szCs w:val="24"/>
-        </w:rPr>
-        <w:t xml:space="preserve"> gesendet werden.</w:t>
+        <w:t xml:space="preserve"> können jetzt weitere Programme über das Xmodem-Protokoll mit TeraTerm gesendet werden.</w:t>
       </w:r>
     </w:p>
     <w:p>
@@ -2318,19 +2164,8 @@
           <w:sz w:val="24"/>
           <w:szCs w:val="24"/>
         </w:rPr>
-        <w:t xml:space="preserve">NPCGET </w:t>
-      </w:r>
-      <w:proofErr w:type="spellStart"/>
-      <w:r>
-        <w:rPr>
-          <w:rFonts w:ascii="Arial" w:hAnsi="Arial" w:cs="Arial"/>
-          <w:b/>
-          <w:sz w:val="24"/>
-          <w:szCs w:val="24"/>
-        </w:rPr>
-        <w:t>dateiname</w:t>
-      </w:r>
-      <w:proofErr w:type="spellEnd"/>
+        <w:t>NPCGET dateiname</w:t>
+      </w:r>
       <w:r>
         <w:rPr>
           <w:rFonts w:ascii="Arial" w:hAnsi="Arial" w:cs="Arial"/>
@@ -2345,25 +2180,7 @@
           <w:sz w:val="24"/>
           <w:szCs w:val="24"/>
         </w:rPr>
-        <w:t xml:space="preserve">oder das Programm in </w:t>
-      </w:r>
-      <w:proofErr w:type="spellStart"/>
-      <w:r>
-        <w:rPr>
-          <w:rFonts w:ascii="Arial" w:hAnsi="Arial" w:cs="Arial"/>
-          <w:sz w:val="24"/>
-          <w:szCs w:val="24"/>
-        </w:rPr>
-        <w:t>TeraTerm</w:t>
-      </w:r>
-      <w:proofErr w:type="spellEnd"/>
-      <w:r>
-        <w:rPr>
-          <w:rFonts w:ascii="Arial" w:hAnsi="Arial" w:cs="Arial"/>
-          <w:sz w:val="24"/>
-          <w:szCs w:val="24"/>
-        </w:rPr>
-        <w:t xml:space="preserve"> mit </w:t>
+        <w:t xml:space="preserve">oder das Programm in TeraTerm mit </w:t>
       </w:r>
       <w:r>
         <w:rPr>
@@ -2404,25 +2221,7 @@
           <w:sz w:val="24"/>
           <w:szCs w:val="24"/>
         </w:rPr>
-        <w:t xml:space="preserve"> Repository von Ulrich </w:t>
-      </w:r>
-      <w:proofErr w:type="spellStart"/>
-      <w:r>
-        <w:rPr>
-          <w:rFonts w:ascii="Arial" w:hAnsi="Arial" w:cs="Arial"/>
-          <w:sz w:val="24"/>
-          <w:szCs w:val="24"/>
-        </w:rPr>
-        <w:t>Haumann</w:t>
-      </w:r>
-      <w:proofErr w:type="spellEnd"/>
-      <w:r>
-        <w:rPr>
-          <w:rFonts w:ascii="Arial" w:hAnsi="Arial" w:cs="Arial"/>
-          <w:sz w:val="24"/>
-          <w:szCs w:val="24"/>
-        </w:rPr>
-        <w:t xml:space="preserve"> </w:t>
+        <w:t xml:space="preserve"> Repository von Ulrich Haumann </w:t>
       </w:r>
       <w:hyperlink r:id="rId7" w:history="1">
         <w:r>
@@ -2522,7 +2321,13 @@
       <w:rPr>
         <w:rFonts w:asciiTheme="majorHAnsi" w:eastAsiaTheme="majorEastAsia" w:hAnsiTheme="majorHAnsi" w:cstheme="majorBidi"/>
       </w:rPr>
-      <w:t xml:space="preserve">Bootfähiges </w:t>
+      <w:t>Bootfähige</w:t>
+    </w:r>
+    <w:r>
+      <w:rPr>
+        <w:rFonts w:asciiTheme="majorHAnsi" w:eastAsiaTheme="majorEastAsia" w:hAnsiTheme="majorHAnsi" w:cstheme="majorBidi"/>
+      </w:rPr>
+      <w:t xml:space="preserve"> </w:t>
     </w:r>
     <w:r>
       <w:rPr>
@@ -2535,6 +2340,12 @@
         <w:rFonts w:asciiTheme="majorHAnsi" w:eastAsiaTheme="majorEastAsia" w:hAnsiTheme="majorHAnsi" w:cstheme="majorBidi"/>
       </w:rPr>
       <w:t>erstellen</w:t>
+    </w:r>
+    <w:r>
+      <w:rPr>
+        <w:rFonts w:asciiTheme="majorHAnsi" w:eastAsiaTheme="majorEastAsia" w:hAnsiTheme="majorHAnsi" w:cstheme="majorBidi"/>
+      </w:rPr>
+      <w:t>, Stand 26.07.2026</w:t>
     </w:r>
     <w:r>
       <w:rPr>
@@ -2574,7 +2385,7 @@
       <w:rPr>
         <w:noProof/>
       </w:rPr>
-      <w:t xml:space="preserve"> 2 -</w:t>
+      <w:t xml:space="preserve"> 1 -</w:t>
     </w:r>
     <w:r>
       <w:rPr>
@@ -2707,8 +2518,100 @@
       </w:pPr>
     </w:lvl>
   </w:abstractNum>
+  <w:abstractNum w:abstractNumId="1">
+    <w:nsid w:val="66AF0734"/>
+    <w:multiLevelType w:val="hybridMultilevel"/>
+    <w:tmpl w:val="CD4205C2"/>
+    <w:lvl w:ilvl="0" w:tplc="0407000F">
+      <w:start w:val="1"/>
+      <w:numFmt w:val="decimal"/>
+      <w:lvlText w:val="%1."/>
+      <w:lvlJc w:val="left"/>
+      <w:pPr>
+        <w:ind w:left="360" w:hanging="360"/>
+      </w:pPr>
+      <w:rPr>
+        <w:rFonts w:hint="default"/>
+      </w:rPr>
+    </w:lvl>
+    <w:lvl w:ilvl="1" w:tplc="04070019" w:tentative="1">
+      <w:start w:val="1"/>
+      <w:numFmt w:val="lowerLetter"/>
+      <w:lvlText w:val="%2."/>
+      <w:lvlJc w:val="left"/>
+      <w:pPr>
+        <w:ind w:left="1080" w:hanging="360"/>
+      </w:pPr>
+    </w:lvl>
+    <w:lvl w:ilvl="2" w:tplc="0407001B" w:tentative="1">
+      <w:start w:val="1"/>
+      <w:numFmt w:val="lowerRoman"/>
+      <w:lvlText w:val="%3."/>
+      <w:lvlJc w:val="right"/>
+      <w:pPr>
+        <w:ind w:left="1800" w:hanging="180"/>
+      </w:pPr>
+    </w:lvl>
+    <w:lvl w:ilvl="3" w:tplc="0407000F" w:tentative="1">
+      <w:start w:val="1"/>
+      <w:numFmt w:val="decimal"/>
+      <w:lvlText w:val="%4."/>
+      <w:lvlJc w:val="left"/>
+      <w:pPr>
+        <w:ind w:left="2520" w:hanging="360"/>
+      </w:pPr>
+    </w:lvl>
+    <w:lvl w:ilvl="4" w:tplc="04070019" w:tentative="1">
+      <w:start w:val="1"/>
+      <w:numFmt w:val="lowerLetter"/>
+      <w:lvlText w:val="%5."/>
+      <w:lvlJc w:val="left"/>
+      <w:pPr>
+        <w:ind w:left="3240" w:hanging="360"/>
+      </w:pPr>
+    </w:lvl>
+    <w:lvl w:ilvl="5" w:tplc="0407001B" w:tentative="1">
+      <w:start w:val="1"/>
+      <w:numFmt w:val="lowerRoman"/>
+      <w:lvlText w:val="%6."/>
+      <w:lvlJc w:val="right"/>
+      <w:pPr>
+        <w:ind w:left="3960" w:hanging="180"/>
+      </w:pPr>
+    </w:lvl>
+    <w:lvl w:ilvl="6" w:tplc="0407000F" w:tentative="1">
+      <w:start w:val="1"/>
+      <w:numFmt w:val="decimal"/>
+      <w:lvlText w:val="%7."/>
+      <w:lvlJc w:val="left"/>
+      <w:pPr>
+        <w:ind w:left="4680" w:hanging="360"/>
+      </w:pPr>
+    </w:lvl>
+    <w:lvl w:ilvl="7" w:tplc="04070019" w:tentative="1">
+      <w:start w:val="1"/>
+      <w:numFmt w:val="lowerLetter"/>
+      <w:lvlText w:val="%8."/>
+      <w:lvlJc w:val="left"/>
+      <w:pPr>
+        <w:ind w:left="5400" w:hanging="360"/>
+      </w:pPr>
+    </w:lvl>
+    <w:lvl w:ilvl="8" w:tplc="0407001B" w:tentative="1">
+      <w:start w:val="1"/>
+      <w:numFmt w:val="lowerRoman"/>
+      <w:lvlText w:val="%9."/>
+      <w:lvlJc w:val="right"/>
+      <w:pPr>
+        <w:ind w:left="6120" w:hanging="180"/>
+      </w:pPr>
+    </w:lvl>
+  </w:abstractNum>
   <w:num w:numId="1">
     <w:abstractNumId w:val="0"/>
+  </w:num>
+  <w:num w:numId="2">
+    <w:abstractNumId w:val="1"/>
   </w:num>
 </w:numbering>
 </file>

</xml_diff>

<commit_message>
Neue BIOS Version, neue Tool DISKTEST
DISKTEST noch unfertig.
</commit_message>
<xml_diff>
--- a/NBIOS/Bootfähige MINI disk erstellen.docx
+++ b/NBIOS/Bootfähige MINI disk erstellen.docx
@@ -928,6 +928,33 @@
           <w:szCs w:val="24"/>
         </w:rPr>
         <w:t>die Diskette</w:t>
+      </w:r>
+    </w:p>
+    <w:p>
+      <w:pPr>
+        <w:ind w:left="2832" w:hanging="2832"/>
+        <w:rPr>
+          <w:rFonts w:ascii="Arial" w:hAnsi="Arial" w:cs="Arial"/>
+          <w:sz w:val="24"/>
+          <w:szCs w:val="24"/>
+        </w:rPr>
+      </w:pPr>
+      <w:r>
+        <w:rPr>
+          <w:rFonts w:ascii="Arial" w:hAnsi="Arial" w:cs="Arial"/>
+          <w:sz w:val="24"/>
+          <w:szCs w:val="24"/>
+        </w:rPr>
+        <w:t>NGET.HEX</w:t>
+      </w:r>
+      <w:r>
+        <w:rPr>
+          <w:rFonts w:ascii="Arial" w:hAnsi="Arial" w:cs="Arial"/>
+          <w:sz w:val="24"/>
+          <w:szCs w:val="24"/>
+        </w:rPr>
+        <w:tab/>
+        <w:t>Transfer-Programm</w:t>
       </w:r>
     </w:p>
     <w:p>
@@ -1222,6 +1249,14 @@
           <w:szCs w:val="24"/>
         </w:rPr>
         <w:br/>
+      </w:r>
+      <w:r>
+        <w:rPr>
+          <w:rFonts w:ascii="Arial" w:hAnsi="Arial" w:cs="Arial"/>
+          <w:sz w:val="24"/>
+          <w:szCs w:val="24"/>
+        </w:rPr>
+        <w:lastRenderedPageBreak/>
         <w:t>- Laufwerk A (1)</w:t>
       </w:r>
       <w:r>
@@ -1264,7 +1299,6 @@
           <w:sz w:val="24"/>
           <w:szCs w:val="24"/>
         </w:rPr>
-        <w:lastRenderedPageBreak/>
         <w:t>Wenn die For</w:t>
       </w:r>
       <w:r>
@@ -1942,7 +1976,16 @@
           <w:sz w:val="24"/>
           <w:szCs w:val="24"/>
         </w:rPr>
-        <w:t>Das Programm NPCGET übertragen</w:t>
+        <w:t>Das Programm N</w:t>
+      </w:r>
+      <w:r>
+        <w:rPr>
+          <w:rFonts w:ascii="Arial" w:hAnsi="Arial" w:cs="Arial"/>
+          <w:b/>
+          <w:sz w:val="24"/>
+          <w:szCs w:val="24"/>
+        </w:rPr>
+        <w:t>GET übertragen</w:t>
       </w:r>
     </w:p>
     <w:p>
@@ -2002,7 +2045,7 @@
           <w:sz w:val="24"/>
           <w:szCs w:val="24"/>
         </w:rPr>
-        <w:t>PCGET</w:t>
+        <w:t>GET</w:t>
       </w:r>
       <w:r>
         <w:rPr>
@@ -2052,33 +2095,108 @@
           <w:sz w:val="24"/>
           <w:szCs w:val="24"/>
         </w:rPr>
-        <w:t>Dann RESET-Taste drücken (nicht ausschalten) und mit „</w:t>
-      </w:r>
-      <w:r>
-        <w:rPr>
-          <w:rFonts w:ascii="Arial" w:hAnsi="Arial" w:cs="Arial"/>
-          <w:b/>
-          <w:sz w:val="24"/>
-          <w:szCs w:val="24"/>
-        </w:rPr>
-        <w:t>I</w:t>
-      </w:r>
-      <w:r>
-        <w:rPr>
-          <w:rFonts w:ascii="Arial" w:hAnsi="Arial" w:cs="Arial"/>
-          <w:sz w:val="24"/>
-          <w:szCs w:val="24"/>
-        </w:rPr>
-        <w:t>“ vom IDE/CF-Medium booten. NPCGET.HEX befindet sich immer noch im Speicher und kann mit dem CP/M-Kommando „</w:t>
-      </w:r>
-      <w:r>
-        <w:rPr>
-          <w:rFonts w:ascii="Arial" w:hAnsi="Arial" w:cs="Arial"/>
-          <w:b/>
-          <w:sz w:val="24"/>
-          <w:szCs w:val="24"/>
-        </w:rPr>
-        <w:t>save 5 npcget.com</w:t>
+        <w:t xml:space="preserve">Da der Bootloader </w:t>
+      </w:r>
+      <w:r>
+        <w:rPr>
+          <w:rFonts w:ascii="Arial" w:hAnsi="Arial" w:cs="Arial"/>
+          <w:sz w:val="24"/>
+          <w:szCs w:val="24"/>
+        </w:rPr>
+        <w:t xml:space="preserve">das Programm an Adresse </w:t>
+      </w:r>
+      <w:r>
+        <w:rPr>
+          <w:rFonts w:ascii="Arial" w:hAnsi="Arial" w:cs="Arial"/>
+          <w:sz w:val="24"/>
+          <w:szCs w:val="24"/>
+        </w:rPr>
+        <w:t xml:space="preserve">100h </w:t>
+      </w:r>
+      <w:r>
+        <w:rPr>
+          <w:rFonts w:ascii="Arial" w:hAnsi="Arial" w:cs="Arial"/>
+          <w:sz w:val="24"/>
+          <w:szCs w:val="24"/>
+        </w:rPr>
+        <w:t xml:space="preserve">überschreiben </w:t>
+      </w:r>
+      <w:r>
+        <w:rPr>
+          <w:rFonts w:ascii="Arial" w:hAnsi="Arial" w:cs="Arial"/>
+          <w:sz w:val="24"/>
+          <w:szCs w:val="24"/>
+        </w:rPr>
+        <w:t xml:space="preserve">würde, </w:t>
+      </w:r>
+      <w:r>
+        <w:rPr>
+          <w:rFonts w:ascii="Arial" w:hAnsi="Arial" w:cs="Arial"/>
+          <w:sz w:val="24"/>
+          <w:szCs w:val="24"/>
+        </w:rPr>
+        <w:t xml:space="preserve">startet man das CP/M direkt mit dem Monitor Befehl </w:t>
+      </w:r>
+      <w:r>
+        <w:rPr>
+          <w:rFonts w:ascii="Arial" w:hAnsi="Arial" w:cs="Arial"/>
+          <w:b/>
+          <w:sz w:val="24"/>
+          <w:szCs w:val="24"/>
+        </w:rPr>
+        <w:t>ge2</w:t>
+      </w:r>
+      <w:r>
+        <w:rPr>
+          <w:rFonts w:ascii="Arial" w:hAnsi="Arial" w:cs="Arial"/>
+          <w:b/>
+          <w:sz w:val="24"/>
+          <w:szCs w:val="24"/>
+        </w:rPr>
+        <w:t>00</w:t>
+      </w:r>
+      <w:r>
+        <w:rPr>
+          <w:rFonts w:ascii="Arial" w:hAnsi="Arial" w:cs="Arial"/>
+          <w:sz w:val="24"/>
+          <w:szCs w:val="24"/>
+        </w:rPr>
+        <w:t>.</w:t>
+      </w:r>
+    </w:p>
+    <w:p>
+      <w:pPr>
+        <w:rPr>
+          <w:rFonts w:ascii="Arial" w:hAnsi="Arial" w:cs="Arial"/>
+          <w:sz w:val="24"/>
+          <w:szCs w:val="24"/>
+        </w:rPr>
+      </w:pPr>
+      <w:r>
+        <w:rPr>
+          <w:rFonts w:ascii="Arial" w:hAnsi="Arial" w:cs="Arial"/>
+          <w:sz w:val="24"/>
+          <w:szCs w:val="24"/>
+        </w:rPr>
+        <w:t>NGET.HEX befindet sich immer noch im Speicher und kann mit dem CP/M-Kommando „</w:t>
+      </w:r>
+      <w:r>
+        <w:rPr>
+          <w:rFonts w:ascii="Arial" w:hAnsi="Arial" w:cs="Arial"/>
+          <w:b/>
+          <w:sz w:val="24"/>
+          <w:szCs w:val="24"/>
+        </w:rPr>
+        <w:t>save 5 n</w:t>
+      </w:r>
+      <w:r>
+        <w:rPr>
+          <w:rFonts w:ascii="Arial" w:hAnsi="Arial" w:cs="Arial"/>
+          <w:b/>
+          <w:sz w:val="24"/>
+          <w:szCs w:val="24"/>
+        </w:rPr>
+        <w:t>get.com</w:t>
       </w:r>
       <w:r>
         <w:rPr>
@@ -2121,15 +2239,6 @@
           <w:sz w:val="24"/>
           <w:szCs w:val="24"/>
         </w:rPr>
-        <w:t>PC</w:t>
-      </w:r>
-      <w:r>
-        <w:rPr>
-          <w:rFonts w:ascii="Arial" w:hAnsi="Arial" w:cs="Arial"/>
-          <w:b/>
-          <w:sz w:val="24"/>
-          <w:szCs w:val="24"/>
-        </w:rPr>
         <w:t>GET</w:t>
       </w:r>
       <w:r>
@@ -2164,7 +2273,16 @@
           <w:sz w:val="24"/>
           <w:szCs w:val="24"/>
         </w:rPr>
-        <w:t>NPCGET dateiname</w:t>
+        <w:t>N</w:t>
+      </w:r>
+      <w:r>
+        <w:rPr>
+          <w:rFonts w:ascii="Arial" w:hAnsi="Arial" w:cs="Arial"/>
+          <w:b/>
+          <w:sz w:val="24"/>
+          <w:szCs w:val="24"/>
+        </w:rPr>
+        <w:t>GET dateiname</w:t>
       </w:r>
       <w:r>
         <w:rPr>
@@ -2240,7 +2358,16 @@
           <w:sz w:val="24"/>
           <w:szCs w:val="24"/>
         </w:rPr>
-        <w:t xml:space="preserve"> im Verzeichnis CF-Software. Allerdings werden dort andere Programmnamen und ggf. auch andere Programmadressen verwen</w:t>
+        <w:t xml:space="preserve"> im Verzeichnis CF-</w:t>
+      </w:r>
+      <w:r>
+        <w:rPr>
+          <w:rFonts w:ascii="Arial" w:hAnsi="Arial" w:cs="Arial"/>
+          <w:sz w:val="24"/>
+          <w:szCs w:val="24"/>
+        </w:rPr>
+        <w:lastRenderedPageBreak/>
+        <w:t>Software. Allerdings werden dort andere Programmnamen und ggf. auch andere Programmadressen verwen</w:t>
       </w:r>
       <w:r>
         <w:rPr>
@@ -2269,7 +2396,12 @@
       </w:pPr>
     </w:p>
     <w:sectPr>
-      <w:footerReference w:type="default" r:id="rId8"/>
+      <w:headerReference w:type="even" r:id="rId8"/>
+      <w:headerReference w:type="default" r:id="rId9"/>
+      <w:footerReference w:type="even" r:id="rId10"/>
+      <w:footerReference w:type="default" r:id="rId11"/>
+      <w:headerReference w:type="first" r:id="rId12"/>
+      <w:footerReference w:type="first" r:id="rId13"/>
       <w:pgSz w:w="11906" w:h="16838"/>
       <w:pgMar w:top="1417" w:right="1417" w:bottom="1134" w:left="1417" w:header="708" w:footer="708" w:gutter="0"/>
       <w:pgNumType w:fmt="numberInDash"/>
@@ -2306,6 +2438,16 @@
 </file>
 
 <file path=word/footer1.xml><?xml version="1.0" encoding="utf-8"?>
+<w:ftr xmlns:ve="http://schemas.openxmlformats.org/markup-compatibility/2006" xmlns:o="urn:schemas-microsoft-com:office:office" xmlns:r="http://schemas.openxmlformats.org/officeDocument/2006/relationships" xmlns:m="http://schemas.openxmlformats.org/officeDocument/2006/math" xmlns:v="urn:schemas-microsoft-com:vml" xmlns:wp="http://schemas.openxmlformats.org/drawingml/2006/wordprocessingDrawing" xmlns:w10="urn:schemas-microsoft-com:office:word" xmlns:w="http://schemas.openxmlformats.org/wordprocessingml/2006/main" xmlns:wne="http://schemas.microsoft.com/office/word/2006/wordml">
+  <w:p>
+    <w:pPr>
+      <w:pStyle w:val="Fuzeile"/>
+    </w:pPr>
+  </w:p>
+</w:ftr>
+</file>
+
+<file path=word/footer2.xml><?xml version="1.0" encoding="utf-8"?>
 <w:ftr xmlns:ve="http://schemas.openxmlformats.org/markup-compatibility/2006" xmlns:o="urn:schemas-microsoft-com:office:office" xmlns:r="http://schemas.openxmlformats.org/officeDocument/2006/relationships" xmlns:m="http://schemas.openxmlformats.org/officeDocument/2006/math" xmlns:v="urn:schemas-microsoft-com:vml" xmlns:wp="http://schemas.openxmlformats.org/drawingml/2006/wordprocessingDrawing" xmlns:w10="urn:schemas-microsoft-com:office:word" xmlns:w="http://schemas.openxmlformats.org/wordprocessingml/2006/main" xmlns:wne="http://schemas.microsoft.com/office/word/2006/wordml">
   <w:p>
     <w:pPr>
@@ -2345,7 +2487,13 @@
       <w:rPr>
         <w:rFonts w:asciiTheme="majorHAnsi" w:eastAsiaTheme="majorEastAsia" w:hAnsiTheme="majorHAnsi" w:cstheme="majorBidi"/>
       </w:rPr>
-      <w:t>, Stand 26.07.2026</w:t>
+      <w:t>, Stand 02.08</w:t>
+    </w:r>
+    <w:r>
+      <w:rPr>
+        <w:rFonts w:asciiTheme="majorHAnsi" w:eastAsiaTheme="majorEastAsia" w:hAnsiTheme="majorHAnsi" w:cstheme="majorBidi"/>
+      </w:rPr>
+      <w:t>.2026</w:t>
     </w:r>
     <w:r>
       <w:rPr>
@@ -2385,7 +2533,7 @@
       <w:rPr>
         <w:noProof/>
       </w:rPr>
-      <w:t xml:space="preserve"> 1 -</w:t>
+      <w:t xml:space="preserve"> 2 -</w:t>
     </w:r>
     <w:r>
       <w:rPr>
@@ -2402,6 +2550,16 @@
 </w:ftr>
 </file>
 
+<file path=word/footer3.xml><?xml version="1.0" encoding="utf-8"?>
+<w:ftr xmlns:ve="http://schemas.openxmlformats.org/markup-compatibility/2006" xmlns:o="urn:schemas-microsoft-com:office:office" xmlns:r="http://schemas.openxmlformats.org/officeDocument/2006/relationships" xmlns:m="http://schemas.openxmlformats.org/officeDocument/2006/math" xmlns:v="urn:schemas-microsoft-com:vml" xmlns:wp="http://schemas.openxmlformats.org/drawingml/2006/wordprocessingDrawing" xmlns:w10="urn:schemas-microsoft-com:office:word" xmlns:w="http://schemas.openxmlformats.org/wordprocessingml/2006/main" xmlns:wne="http://schemas.microsoft.com/office/word/2006/wordml">
+  <w:p>
+    <w:pPr>
+      <w:pStyle w:val="Fuzeile"/>
+    </w:pPr>
+  </w:p>
+</w:ftr>
+</file>
+
 <file path=word/footnotes.xml><?xml version="1.0" encoding="utf-8"?>
 <w:footnotes xmlns:ve="http://schemas.openxmlformats.org/markup-compatibility/2006" xmlns:o="urn:schemas-microsoft-com:office:office" xmlns:r="http://schemas.openxmlformats.org/officeDocument/2006/relationships" xmlns:m="http://schemas.openxmlformats.org/officeDocument/2006/math" xmlns:v="urn:schemas-microsoft-com:vml" xmlns:wp="http://schemas.openxmlformats.org/drawingml/2006/wordprocessingDrawing" xmlns:w10="urn:schemas-microsoft-com:office:word" xmlns:w="http://schemas.openxmlformats.org/wordprocessingml/2006/main" xmlns:wne="http://schemas.microsoft.com/office/word/2006/wordml">
   <w:footnote w:type="separator" w:id="-1">
@@ -2425,6 +2583,36 @@
     </w:p>
   </w:footnote>
 </w:footnotes>
+</file>
+
+<file path=word/header1.xml><?xml version="1.0" encoding="utf-8"?>
+<w:hdr xmlns:ve="http://schemas.openxmlformats.org/markup-compatibility/2006" xmlns:o="urn:schemas-microsoft-com:office:office" xmlns:r="http://schemas.openxmlformats.org/officeDocument/2006/relationships" xmlns:m="http://schemas.openxmlformats.org/officeDocument/2006/math" xmlns:v="urn:schemas-microsoft-com:vml" xmlns:wp="http://schemas.openxmlformats.org/drawingml/2006/wordprocessingDrawing" xmlns:w10="urn:schemas-microsoft-com:office:word" xmlns:w="http://schemas.openxmlformats.org/wordprocessingml/2006/main" xmlns:wne="http://schemas.microsoft.com/office/word/2006/wordml">
+  <w:p>
+    <w:pPr>
+      <w:pStyle w:val="Kopfzeile"/>
+    </w:pPr>
+  </w:p>
+</w:hdr>
+</file>
+
+<file path=word/header2.xml><?xml version="1.0" encoding="utf-8"?>
+<w:hdr xmlns:ve="http://schemas.openxmlformats.org/markup-compatibility/2006" xmlns:o="urn:schemas-microsoft-com:office:office" xmlns:r="http://schemas.openxmlformats.org/officeDocument/2006/relationships" xmlns:m="http://schemas.openxmlformats.org/officeDocument/2006/math" xmlns:v="urn:schemas-microsoft-com:vml" xmlns:wp="http://schemas.openxmlformats.org/drawingml/2006/wordprocessingDrawing" xmlns:w10="urn:schemas-microsoft-com:office:word" xmlns:w="http://schemas.openxmlformats.org/wordprocessingml/2006/main" xmlns:wne="http://schemas.microsoft.com/office/word/2006/wordml">
+  <w:p>
+    <w:pPr>
+      <w:pStyle w:val="Kopfzeile"/>
+    </w:pPr>
+  </w:p>
+</w:hdr>
+</file>
+
+<file path=word/header3.xml><?xml version="1.0" encoding="utf-8"?>
+<w:hdr xmlns:ve="http://schemas.openxmlformats.org/markup-compatibility/2006" xmlns:o="urn:schemas-microsoft-com:office:office" xmlns:r="http://schemas.openxmlformats.org/officeDocument/2006/relationships" xmlns:m="http://schemas.openxmlformats.org/officeDocument/2006/math" xmlns:v="urn:schemas-microsoft-com:vml" xmlns:wp="http://schemas.openxmlformats.org/drawingml/2006/wordprocessingDrawing" xmlns:w10="urn:schemas-microsoft-com:office:word" xmlns:w="http://schemas.openxmlformats.org/wordprocessingml/2006/main" xmlns:wne="http://schemas.microsoft.com/office/word/2006/wordml">
+  <w:p>
+    <w:pPr>
+      <w:pStyle w:val="Kopfzeile"/>
+    </w:pPr>
+  </w:p>
+</w:hdr>
 </file>
 
 <file path=word/numbering.xml><?xml version="1.0" encoding="utf-8"?>

</xml_diff>

<commit_message>
Bootloader an Tools revised
</commit_message>
<xml_diff>
--- a/NBIOS/Bootfähige MINI disk erstellen.docx
+++ b/NBIOS/Bootfähige MINI disk erstellen.docx
@@ -71,7 +71,25 @@
           <w:sz w:val="24"/>
           <w:szCs w:val="24"/>
         </w:rPr>
-        <w:t>Diese Anleitung ist lediglich eine Ergänzung zur Anleitung von Ulrich Haumann. Die Ergänzun</w:t>
+        <w:t xml:space="preserve">Diese Anleitung ist lediglich eine Ergänzung zur Anleitung von Ulrich </w:t>
+      </w:r>
+      <w:proofErr w:type="spellStart"/>
+      <w:r>
+        <w:rPr>
+          <w:rFonts w:ascii="Arial" w:hAnsi="Arial" w:cs="Arial"/>
+          <w:sz w:val="24"/>
+          <w:szCs w:val="24"/>
+        </w:rPr>
+        <w:t>Haumann</w:t>
+      </w:r>
+      <w:proofErr w:type="spellEnd"/>
+      <w:r>
+        <w:rPr>
+          <w:rFonts w:ascii="Arial" w:hAnsi="Arial" w:cs="Arial"/>
+          <w:sz w:val="24"/>
+          <w:szCs w:val="24"/>
+        </w:rPr>
+        <w:t>. Die Ergänzun</w:t>
       </w:r>
       <w:r>
         <w:rPr>
@@ -137,7 +155,25 @@
           <w:sz w:val="24"/>
           <w:szCs w:val="24"/>
         </w:rPr>
-        <w:t>Ich empfehle zum Arbeiten mit dem MC CP/M-Computer generell das Windows-Terminal-Programm TeraTerm. A</w:t>
+        <w:t xml:space="preserve">Ich empfehle zum Arbeiten mit dem MC CP/M-Computer generell das Windows-Terminal-Programm </w:t>
+      </w:r>
+      <w:proofErr w:type="spellStart"/>
+      <w:r>
+        <w:rPr>
+          <w:rFonts w:ascii="Arial" w:hAnsi="Arial" w:cs="Arial"/>
+          <w:sz w:val="24"/>
+          <w:szCs w:val="24"/>
+        </w:rPr>
+        <w:t>TeraTerm</w:t>
+      </w:r>
+      <w:proofErr w:type="spellEnd"/>
+      <w:r>
+        <w:rPr>
+          <w:rFonts w:ascii="Arial" w:hAnsi="Arial" w:cs="Arial"/>
+          <w:sz w:val="24"/>
+          <w:szCs w:val="24"/>
+        </w:rPr>
+        <w:t>. A</w:t>
       </w:r>
       <w:r>
         <w:rPr>
@@ -453,7 +489,24 @@
           <w:szCs w:val="24"/>
         </w:rPr>
         <w:tab/>
-        <w:t xml:space="preserve">das </w:t>
+      </w:r>
+      <w:proofErr w:type="gramStart"/>
+      <w:r>
+        <w:rPr>
+          <w:rFonts w:ascii="Arial" w:hAnsi="Arial" w:cs="Arial"/>
+          <w:sz w:val="24"/>
+          <w:szCs w:val="24"/>
+        </w:rPr>
+        <w:t>das</w:t>
+      </w:r>
+      <w:proofErr w:type="gramEnd"/>
+      <w:r>
+        <w:rPr>
+          <w:rFonts w:ascii="Arial" w:hAnsi="Arial" w:cs="Arial"/>
+          <w:sz w:val="24"/>
+          <w:szCs w:val="24"/>
+        </w:rPr>
+        <w:t xml:space="preserve"> </w:t>
       </w:r>
       <w:r>
         <w:rPr>
@@ -773,7 +826,24 @@
           <w:szCs w:val="24"/>
         </w:rPr>
         <w:tab/>
-        <w:t xml:space="preserve">Bootloader </w:t>
+      </w:r>
+      <w:proofErr w:type="spellStart"/>
+      <w:r>
+        <w:rPr>
+          <w:rFonts w:ascii="Arial" w:hAnsi="Arial" w:cs="Arial"/>
+          <w:sz w:val="24"/>
+          <w:szCs w:val="24"/>
+        </w:rPr>
+        <w:t>Bootloader</w:t>
+      </w:r>
+      <w:proofErr w:type="spellEnd"/>
+      <w:r>
+        <w:rPr>
+          <w:rFonts w:ascii="Arial" w:hAnsi="Arial" w:cs="Arial"/>
+          <w:sz w:val="24"/>
+          <w:szCs w:val="24"/>
+        </w:rPr>
+        <w:t xml:space="preserve"> </w:t>
       </w:r>
       <w:r>
         <w:rPr>
@@ -897,13 +967,23 @@
         </w:rPr>
         <w:t xml:space="preserve">den </w:t>
       </w:r>
-      <w:r>
-        <w:rPr>
-          <w:rFonts w:ascii="Arial" w:hAnsi="Arial" w:cs="Arial"/>
-          <w:sz w:val="24"/>
-          <w:szCs w:val="24"/>
-        </w:rPr>
-        <w:t xml:space="preserve">Bootloader </w:t>
+      <w:proofErr w:type="spellStart"/>
+      <w:r>
+        <w:rPr>
+          <w:rFonts w:ascii="Arial" w:hAnsi="Arial" w:cs="Arial"/>
+          <w:sz w:val="24"/>
+          <w:szCs w:val="24"/>
+        </w:rPr>
+        <w:t>Bootloader</w:t>
+      </w:r>
+      <w:proofErr w:type="spellEnd"/>
+      <w:r>
+        <w:rPr>
+          <w:rFonts w:ascii="Arial" w:hAnsi="Arial" w:cs="Arial"/>
+          <w:sz w:val="24"/>
+          <w:szCs w:val="24"/>
+        </w:rPr>
+        <w:t xml:space="preserve"> </w:t>
       </w:r>
       <w:r>
         <w:rPr>
@@ -1307,7 +1387,25 @@
           <w:sz w:val="24"/>
           <w:szCs w:val="24"/>
         </w:rPr>
-        <w:t xml:space="preserve">matierung komplett duchgelaufen, </w:t>
+        <w:t xml:space="preserve">matierung komplett </w:t>
+      </w:r>
+      <w:proofErr w:type="spellStart"/>
+      <w:r>
+        <w:rPr>
+          <w:rFonts w:ascii="Arial" w:hAnsi="Arial" w:cs="Arial"/>
+          <w:sz w:val="24"/>
+          <w:szCs w:val="24"/>
+        </w:rPr>
+        <w:t>duchgelaufen</w:t>
+      </w:r>
+      <w:proofErr w:type="spellEnd"/>
+      <w:r>
+        <w:rPr>
+          <w:rFonts w:ascii="Arial" w:hAnsi="Arial" w:cs="Arial"/>
+          <w:sz w:val="24"/>
+          <w:szCs w:val="24"/>
+        </w:rPr>
+        <w:t xml:space="preserve">, </w:t>
       </w:r>
       <w:r>
         <w:rPr>
@@ -1904,7 +2002,43 @@
           <w:sz w:val="24"/>
           <w:szCs w:val="24"/>
         </w:rPr>
-        <w:t xml:space="preserve">ist jetzt bootfähig und enthält das CP/M System. Nach eine Reset kann </w:t>
+        <w:t xml:space="preserve">ist jetzt bootfähig und enthält das CP/M System. Nach </w:t>
+      </w:r>
+      <w:proofErr w:type="gramStart"/>
+      <w:r>
+        <w:rPr>
+          <w:rFonts w:ascii="Arial" w:hAnsi="Arial" w:cs="Arial"/>
+          <w:sz w:val="24"/>
+          <w:szCs w:val="24"/>
+        </w:rPr>
+        <w:t>eine</w:t>
+      </w:r>
+      <w:proofErr w:type="gramEnd"/>
+      <w:r>
+        <w:rPr>
+          <w:rFonts w:ascii="Arial" w:hAnsi="Arial" w:cs="Arial"/>
+          <w:sz w:val="24"/>
+          <w:szCs w:val="24"/>
+        </w:rPr>
+        <w:t xml:space="preserve"> </w:t>
+      </w:r>
+      <w:proofErr w:type="spellStart"/>
+      <w:r>
+        <w:rPr>
+          <w:rFonts w:ascii="Arial" w:hAnsi="Arial" w:cs="Arial"/>
+          <w:sz w:val="24"/>
+          <w:szCs w:val="24"/>
+        </w:rPr>
+        <w:t>Reset</w:t>
+      </w:r>
+      <w:proofErr w:type="spellEnd"/>
+      <w:r>
+        <w:rPr>
+          <w:rFonts w:ascii="Arial" w:hAnsi="Arial" w:cs="Arial"/>
+          <w:sz w:val="24"/>
+          <w:szCs w:val="24"/>
+        </w:rPr>
+        <w:t xml:space="preserve"> kann </w:t>
       </w:r>
       <w:r>
         <w:rPr>
@@ -2095,7 +2229,25 @@
           <w:sz w:val="24"/>
           <w:szCs w:val="24"/>
         </w:rPr>
-        <w:t xml:space="preserve">Da der Bootloader </w:t>
+        <w:t xml:space="preserve">Da der </w:t>
+      </w:r>
+      <w:proofErr w:type="spellStart"/>
+      <w:r>
+        <w:rPr>
+          <w:rFonts w:ascii="Arial" w:hAnsi="Arial" w:cs="Arial"/>
+          <w:sz w:val="24"/>
+          <w:szCs w:val="24"/>
+        </w:rPr>
+        <w:t>Bootloader</w:t>
+      </w:r>
+      <w:proofErr w:type="spellEnd"/>
+      <w:r>
+        <w:rPr>
+          <w:rFonts w:ascii="Arial" w:hAnsi="Arial" w:cs="Arial"/>
+          <w:sz w:val="24"/>
+          <w:szCs w:val="24"/>
+        </w:rPr>
+        <w:t xml:space="preserve"> </w:t>
       </w:r>
       <w:r>
         <w:rPr>
@@ -2247,17 +2399,52 @@
           <w:sz w:val="24"/>
           <w:szCs w:val="24"/>
         </w:rPr>
-        <w:t xml:space="preserve"> können jetzt weitere Programme über das Xmodem-Protokoll mit TeraTerm gesendet werden.</w:t>
-      </w:r>
-    </w:p>
-    <w:p>
-      <w:pPr>
-        <w:rPr>
-          <w:rFonts w:ascii="Arial" w:hAnsi="Arial" w:cs="Arial"/>
-          <w:sz w:val="24"/>
-          <w:szCs w:val="24"/>
-        </w:rPr>
-      </w:pPr>
+        <w:t xml:space="preserve"> können jetzt weitere Programme über das </w:t>
+      </w:r>
+      <w:proofErr w:type="spellStart"/>
+      <w:r>
+        <w:rPr>
+          <w:rFonts w:ascii="Arial" w:hAnsi="Arial" w:cs="Arial"/>
+          <w:sz w:val="24"/>
+          <w:szCs w:val="24"/>
+        </w:rPr>
+        <w:t>Xmodem</w:t>
+      </w:r>
+      <w:proofErr w:type="spellEnd"/>
+      <w:r>
+        <w:rPr>
+          <w:rFonts w:ascii="Arial" w:hAnsi="Arial" w:cs="Arial"/>
+          <w:sz w:val="24"/>
+          <w:szCs w:val="24"/>
+        </w:rPr>
+        <w:t xml:space="preserve">-Protokoll mit </w:t>
+      </w:r>
+      <w:proofErr w:type="spellStart"/>
+      <w:r>
+        <w:rPr>
+          <w:rFonts w:ascii="Arial" w:hAnsi="Arial" w:cs="Arial"/>
+          <w:sz w:val="24"/>
+          <w:szCs w:val="24"/>
+        </w:rPr>
+        <w:t>TeraTerm</w:t>
+      </w:r>
+      <w:proofErr w:type="spellEnd"/>
+      <w:r>
+        <w:rPr>
+          <w:rFonts w:ascii="Arial" w:hAnsi="Arial" w:cs="Arial"/>
+          <w:sz w:val="24"/>
+          <w:szCs w:val="24"/>
+        </w:rPr>
+        <w:t xml:space="preserve"> gesendet werden.</w:t>
+      </w:r>
+      <w:r>
+        <w:rPr>
+          <w:rFonts w:ascii="Arial" w:hAnsi="Arial" w:cs="Arial"/>
+          <w:sz w:val="24"/>
+          <w:szCs w:val="24"/>
+        </w:rPr>
+        <w:t xml:space="preserve"> </w:t>
+      </w:r>
       <w:r>
         <w:rPr>
           <w:rFonts w:ascii="Arial" w:hAnsi="Arial" w:cs="Arial"/>
@@ -2282,8 +2469,19 @@
           <w:sz w:val="24"/>
           <w:szCs w:val="24"/>
         </w:rPr>
-        <w:t>GET dateiname</w:t>
-      </w:r>
+        <w:t xml:space="preserve">GET </w:t>
+      </w:r>
+      <w:proofErr w:type="spellStart"/>
+      <w:r>
+        <w:rPr>
+          <w:rFonts w:ascii="Arial" w:hAnsi="Arial" w:cs="Arial"/>
+          <w:b/>
+          <w:sz w:val="24"/>
+          <w:szCs w:val="24"/>
+        </w:rPr>
+        <w:t>dateiname</w:t>
+      </w:r>
+      <w:proofErr w:type="spellEnd"/>
       <w:r>
         <w:rPr>
           <w:rFonts w:ascii="Arial" w:hAnsi="Arial" w:cs="Arial"/>
@@ -2298,7 +2496,25 @@
           <w:sz w:val="24"/>
           <w:szCs w:val="24"/>
         </w:rPr>
-        <w:t xml:space="preserve">oder das Programm in TeraTerm mit </w:t>
+        <w:t xml:space="preserve">oder das Programm in </w:t>
+      </w:r>
+      <w:proofErr w:type="spellStart"/>
+      <w:r>
+        <w:rPr>
+          <w:rFonts w:ascii="Arial" w:hAnsi="Arial" w:cs="Arial"/>
+          <w:sz w:val="24"/>
+          <w:szCs w:val="24"/>
+        </w:rPr>
+        <w:t>TeraTerm</w:t>
+      </w:r>
+      <w:proofErr w:type="spellEnd"/>
+      <w:r>
+        <w:rPr>
+          <w:rFonts w:ascii="Arial" w:hAnsi="Arial" w:cs="Arial"/>
+          <w:sz w:val="24"/>
+          <w:szCs w:val="24"/>
+        </w:rPr>
+        <w:t xml:space="preserve"> mit </w:t>
       </w:r>
       <w:r>
         <w:rPr>
@@ -2339,7 +2555,25 @@
           <w:sz w:val="24"/>
           <w:szCs w:val="24"/>
         </w:rPr>
-        <w:t xml:space="preserve"> Repository von Ulrich Haumann </w:t>
+        <w:t xml:space="preserve"> Repository von Ulrich </w:t>
+      </w:r>
+      <w:proofErr w:type="spellStart"/>
+      <w:r>
+        <w:rPr>
+          <w:rFonts w:ascii="Arial" w:hAnsi="Arial" w:cs="Arial"/>
+          <w:sz w:val="24"/>
+          <w:szCs w:val="24"/>
+        </w:rPr>
+        <w:t>Haumann</w:t>
+      </w:r>
+      <w:proofErr w:type="spellEnd"/>
+      <w:r>
+        <w:rPr>
+          <w:rFonts w:ascii="Arial" w:hAnsi="Arial" w:cs="Arial"/>
+          <w:sz w:val="24"/>
+          <w:szCs w:val="24"/>
+        </w:rPr>
+        <w:t xml:space="preserve"> </w:t>
       </w:r>
       <w:hyperlink r:id="rId7" w:history="1">
         <w:r>
@@ -2358,16 +2592,7 @@
           <w:sz w:val="24"/>
           <w:szCs w:val="24"/>
         </w:rPr>
-        <w:t xml:space="preserve"> im Verzeichnis CF-</w:t>
-      </w:r>
-      <w:r>
-        <w:rPr>
-          <w:rFonts w:ascii="Arial" w:hAnsi="Arial" w:cs="Arial"/>
-          <w:sz w:val="24"/>
-          <w:szCs w:val="24"/>
-        </w:rPr>
-        <w:lastRenderedPageBreak/>
-        <w:t>Software. Allerdings werden dort andere Programmnamen und ggf. auch andere Programmadressen verwen</w:t>
+        <w:t xml:space="preserve"> im Verzeichnis CF-Software. Allerdings werden dort andere Programmnamen und ggf. auch andere Programmadressen verwen</w:t>
       </w:r>
       <w:r>
         <w:rPr>
@@ -2533,7 +2758,7 @@
       <w:rPr>
         <w:noProof/>
       </w:rPr>
-      <w:t xml:space="preserve"> 2 -</w:t>
+      <w:t xml:space="preserve"> 3 -</w:t>
     </w:r>
     <w:r>
       <w:rPr>

</xml_diff>